<commit_message>
feat(templates): enhance microcurricular template generation with dynamic tags and validation checks
</commit_message>
<xml_diff>
--- a/public/formatos/planificacion-microcurricular.template.docx
+++ b/public/formatos/planificacion-microcurricular.template.docx
@@ -54,123 +54,1878 @@
       </w:tblGrid>
       <w:tr>
         <w:trPr>
-          <w:trHeight w:val="545"/>
+          <w:trHeight w:val="266"/>
         </w:trPr>
         <w:tc>
           <w:tcPr>
-            <w:tcW w:w="2372" w:type="dxa"/>
-          </w:tcPr>
-          <w:p>
-            <w:pPr>
-              <w:pStyle w:val="Default"/>
-              <w:rPr>
-                <w:rFonts w:ascii="Arial" w:hAnsi="Arial" w:cs="Arial"/>
-                <w:sz w:val="18"/>
-                <w:szCs w:val="18"/>
-              </w:rPr>
-            </w:pPr>
-          </w:p>
-        </w:tc>
-        <w:tc>
-          <w:tcPr>
-            <w:tcW w:w="1983" w:type="dxa"/>
-            <w:gridSpan w:val="8"/>
-          </w:tcPr>
-          <w:p>
-            <w:pPr>
-              <w:rPr>
-                <w:rFonts w:ascii="Arial" w:hAnsi="Arial" w:cs="Arial"/>
-                <w:color w:val="000000"/>
-                <w:sz w:val="23"/>
-                <w:szCs w:val="23"/>
-              </w:rPr>
-            </w:pPr>
-          </w:p>
-        </w:tc>
-        <w:tc>
-          <w:tcPr>
-            <w:tcW w:w="1830" w:type="dxa"/>
-            <w:gridSpan w:val="2"/>
-          </w:tcPr>
-          <w:p>
-            <w:pPr>
-              <w:rPr>
-                <w:rFonts w:ascii="Arial" w:hAnsi="Arial" w:cs="Arial"/>
-                <w:color w:val="000000"/>
-                <w:sz w:val="23"/>
-                <w:szCs w:val="23"/>
-              </w:rPr>
-            </w:pPr>
-          </w:p>
-        </w:tc>
-        <w:tc>
-          <w:tcPr>
-            <w:tcW w:w="3843" w:type="dxa"/>
-            <w:gridSpan w:val="10"/>
-          </w:tcPr>
-          <w:p>
-            <w:pPr>
-              <w:rPr>
-                <w:rFonts w:ascii="Arial" w:hAnsi="Arial" w:cs="Arial"/>
-                <w:color w:val="000000"/>
-                <w:sz w:val="23"/>
-                <w:szCs w:val="23"/>
-              </w:rPr>
-            </w:pPr>
-          </w:p>
-        </w:tc>
-        <w:tc>
-          <w:tcPr>
-            <w:tcW w:w="1843" w:type="dxa"/>
-            <w:gridSpan w:val="5"/>
-          </w:tcPr>
-          <w:p>
-            <w:pPr>
-              <w:rPr>
-                <w:rFonts w:ascii="Arial" w:hAnsi="Arial" w:cs="Arial"/>
-                <w:color w:val="000000"/>
-                <w:sz w:val="23"/>
-                <w:szCs w:val="23"/>
-              </w:rPr>
-            </w:pPr>
-          </w:p>
-        </w:tc>
-        <w:tc>
-          <w:tcPr>
-            <w:tcW w:w="1563" w:type="dxa"/>
-            <w:gridSpan w:val="4"/>
-          </w:tcPr>
-          <w:p>
-            <w:pPr>
-              <w:pStyle w:val="Default"/>
-              <w:rPr>
-                <w:rFonts w:ascii="Arial" w:hAnsi="Arial" w:cs="Arial"/>
-                <w:sz w:val="23"/>
-                <w:szCs w:val="23"/>
-              </w:rPr>
-            </w:pPr>
-          </w:p>
-        </w:tc>
-        <w:tc>
-          <w:tcPr>
-            <w:tcW w:w="1587" w:type="dxa"/>
-            <w:gridSpan w:val="2"/>
-          </w:tcPr>
-          <w:p>
-            <w:pPr>
-              <w:rPr>
-                <w:rFonts w:ascii="Arial" w:hAnsi="Arial" w:cs="Arial"/>
-                <w:color w:val="000000"/>
-                <w:sz w:val="23"/>
-                <w:szCs w:val="23"/>
-              </w:rPr>
-            </w:pPr>
+            <w:tcW w:w="15021" w:type="dxa"/>
+            <w:gridSpan w:val="32"/>
+            <w:shd w:val="clear" w:color="auto" w:fill="D0CECE" w:themeFill="background2" w:themeFillShade="E6"/>
+          </w:tcPr>
+          <w:p>
+            <w:pPr>
+              <w:jc w:val="center"/>
+              <w:rPr>
+                <w:rFonts w:ascii="Arial" w:hAnsi="Arial" w:cs="Arial"/>
+                <w:b/>
+                <w:sz w:val="20"/>
+                <w:szCs w:val="20"/>
+              </w:rPr>
+            </w:pPr>
+            <w:r>
+              <w:rPr>
+                <w:rFonts w:ascii="Arial" w:hAnsi="Arial" w:cs="Arial"/>
+                <w:b/>
+                <w:sz w:val="20"/>
+                <w:szCs w:val="20"/>
+              </w:rPr>
+              <w:t>PLANIFICACIÓN MICROCURRICULA</w:t>
+            </w:r>
+            <w:r>
+              <w:rPr>
+                <w:rFonts w:ascii="Arial" w:hAnsi="Arial" w:cs="Arial"/>
+                <w:b/>
+                <w:sz w:val="20"/>
+                <w:szCs w:val="20"/>
+              </w:rPr>
+              <w:t>R</w:t>
+            </w:r>
+            <w:r>
+              <w:rPr>
+                <w:rFonts w:ascii="Arial" w:hAnsi="Arial" w:cs="Arial"/>
+                <w:b/>
+                <w:sz w:val="20"/>
+                <w:szCs w:val="20"/>
+              </w:rPr>
+              <w:t xml:space="preserve"> PARA BACHILLERATO TÉCNICO</w:t>
+            </w:r>
+          </w:p>
+          <w:p>
+            <w:pPr>
+              <w:jc w:val="center"/>
+              <w:rPr>
+                <w:rFonts w:ascii="Arial" w:hAnsi="Arial" w:cs="Arial"/>
+                <w:b/>
+                <w:sz w:val="20"/>
+                <w:szCs w:val="20"/>
+              </w:rPr>
+            </w:pPr>
+            <w:r>
+              <w:rPr>
+                <w:rFonts w:ascii="Arial" w:hAnsi="Arial" w:cs="Arial"/>
+                <w:b/>
+                <w:sz w:val="20"/>
+                <w:szCs w:val="20"/>
+              </w:rPr>
+              <w:t>AÑO LECTIVO 202</w:t>
+            </w:r>
+            <w:r>
+              <w:rPr>
+                <w:rFonts w:ascii="Arial" w:hAnsi="Arial" w:cs="Arial"/>
+                <w:b/>
+                <w:sz w:val="20"/>
+                <w:szCs w:val="20"/>
+              </w:rPr>
+              <w:t>5</w:t>
+            </w:r>
+            <w:r>
+              <w:rPr>
+                <w:rFonts w:ascii="Arial" w:hAnsi="Arial" w:cs="Arial"/>
+                <w:b/>
+                <w:sz w:val="20"/>
+                <w:szCs w:val="20"/>
+              </w:rPr>
+              <w:t xml:space="preserve"> - 202</w:t>
+            </w:r>
+            <w:r>
+              <w:rPr>
+                <w:rFonts w:ascii="Arial" w:hAnsi="Arial" w:cs="Arial"/>
+                <w:b/>
+                <w:sz w:val="20"/>
+                <w:szCs w:val="20"/>
+              </w:rPr>
+              <w:t>6</w:t>
+            </w:r>
           </w:p>
         </w:tc>
       </w:tr>
       <w:tr>
         <w:trPr>
-          <w:trHeight w:val="545"/>
+          <w:trHeight w:val="720"/>
+        </w:trPr>
+        <w:tc>
+          <w:tcPr>
+            <w:tcW w:w="15021" w:type="dxa"/>
+            <w:gridSpan w:val="32"/>
+          </w:tcPr>
+          <w:p>
+            <w:pPr>
+              <w:pStyle w:val="Sinespaciado"/>
+              <w:jc w:val="center"/>
+              <w:rPr>
+                <w:rFonts w:ascii="Arial" w:eastAsia="BatangChe" w:hAnsi="Arial" w:cs="Arial"/>
+                <w:sz w:val="20"/>
+                <w:szCs w:val="20"/>
+              </w:rPr>
+            </w:pPr>
+            <w:r>
+              <w:rPr>
+                <w:rFonts w:ascii="Arial" w:hAnsi="Arial" w:cs="Arial"/>
+                <w:noProof/>
+                <w:sz w:val="20"/>
+                <w:szCs w:val="20"/>
+                <w:lang w:eastAsia="es-EC"/>
+              </w:rPr>
+              <w:drawing>
+                <wp:anchor distT="0" distB="217243" distL="128655" distR="127160" simplePos="0" relativeHeight="251680768" behindDoc="1" locked="0" layoutInCell="1" allowOverlap="1" wp14:anchorId="5F744CE6" wp14:editId="760C135D">
+                  <wp:simplePos x="0" y="0"/>
+                  <wp:positionH relativeFrom="column">
+                    <wp:posOffset>8491220</wp:posOffset>
+                  </wp:positionH>
+                  <wp:positionV relativeFrom="paragraph">
+                    <wp:posOffset>97790</wp:posOffset>
+                  </wp:positionV>
+                  <wp:extent cx="425450" cy="533400"/>
+                  <wp:effectExtent l="19050" t="0" r="12700" b="190500"/>
+                  <wp:wrapNone/>
+                  <wp:docPr id="7" name="Imagen 4" descr="https://blancaita.files.wordpress.com/2012/10/dolorosa.jpg"/>
+                  <wp:cNvGraphicFramePr>
+                    <a:graphicFrameLocks xmlns:a="http://schemas.openxmlformats.org/drawingml/2006/main" noChangeAspect="1"/>
+                  </wp:cNvGraphicFramePr>
+                  <a:graphic xmlns:a="http://schemas.openxmlformats.org/drawingml/2006/main">
+                    <a:graphicData uri="http://schemas.openxmlformats.org/drawingml/2006/picture">
+                      <pic:pic xmlns:pic="http://schemas.openxmlformats.org/drawingml/2006/picture">
+                        <pic:nvPicPr>
+                          <pic:cNvPr id="1" name="Imagen 4" descr="https://blancaita.files.wordpress.com/2012/10/dolorosa.jpg"/>
+                          <pic:cNvPicPr>
+                            <a:picLocks noChangeAspect="1" noChangeArrowheads="1"/>
+                          </pic:cNvPicPr>
+                        </pic:nvPicPr>
+                        <pic:blipFill>
+                          <a:blip r:embed="rId8"/>
+                          <a:srcRect/>
+                          <a:stretch>
+                            <a:fillRect/>
+                          </a:stretch>
+                        </pic:blipFill>
+                        <pic:spPr bwMode="auto">
+                          <a:xfrm>
+                            <a:off x="0" y="0"/>
+                            <a:ext cx="425450" cy="533400"/>
+                          </a:xfrm>
+                          <a:prstGeom prst="roundRect">
+                            <a:avLst>
+                              <a:gd name="adj" fmla="val 8594"/>
+                            </a:avLst>
+                          </a:prstGeom>
+                          <a:solidFill>
+                            <a:srgbClr val="FFFFFF">
+                              <a:shade val="85000"/>
+                            </a:srgbClr>
+                          </a:solidFill>
+                          <a:ln>
+                            <a:noFill/>
+                          </a:ln>
+                          <a:effectLst>
+                            <a:reflection blurRad="12700" stA="38000" endPos="28000" dist="5000" dir="5400000" sy="-100000" algn="bl" rotWithShape="0"/>
+                          </a:effectLst>
+                        </pic:spPr>
+                      </pic:pic>
+                    </a:graphicData>
+                  </a:graphic>
+                  <wp14:sizeRelH relativeFrom="page">
+                    <wp14:pctWidth>0</wp14:pctWidth>
+                  </wp14:sizeRelH>
+                  <wp14:sizeRelV relativeFrom="page">
+                    <wp14:pctHeight>0</wp14:pctHeight>
+                  </wp14:sizeRelV>
+                </wp:anchor>
+              </w:drawing>
+            </w:r>
+          </w:p>
+          <w:p>
+            <w:pPr>
+              <w:pStyle w:val="Sinespaciado"/>
+              <w:jc w:val="center"/>
+              <w:rPr>
+                <w:rFonts w:ascii="Arial" w:eastAsia="BatangChe" w:hAnsi="Arial" w:cs="Arial"/>
+                <w:sz w:val="20"/>
+                <w:szCs w:val="20"/>
+              </w:rPr>
+            </w:pPr>
+            <w:r>
+              <w:rPr>
+                <w:rFonts w:ascii="Arial" w:hAnsi="Arial" w:cs="Arial"/>
+                <w:noProof/>
+                <w:sz w:val="20"/>
+                <w:szCs w:val="20"/>
+                <w:lang w:eastAsia="es-EC"/>
+              </w:rPr>
+              <w:drawing>
+                <wp:anchor distT="0" distB="0" distL="114300" distR="114300" simplePos="0" relativeHeight="251658240" behindDoc="1" locked="0" layoutInCell="1" allowOverlap="1" wp14:anchorId="0705679B" wp14:editId="757BDD8C">
+                  <wp:simplePos x="0" y="0"/>
+                  <wp:positionH relativeFrom="margin">
+                    <wp:posOffset>71120</wp:posOffset>
+                  </wp:positionH>
+                  <wp:positionV relativeFrom="paragraph">
+                    <wp:posOffset>53340</wp:posOffset>
+                  </wp:positionV>
+                  <wp:extent cx="1371600" cy="438150"/>
+                  <wp:effectExtent l="0" t="0" r="0" b="0"/>
+                  <wp:wrapNone/>
+                  <wp:docPr id="8" name="Imagen 3"/>
+                  <wp:cNvGraphicFramePr>
+                    <a:graphicFrameLocks xmlns:a="http://schemas.openxmlformats.org/drawingml/2006/main" noChangeAspect="1"/>
+                  </wp:cNvGraphicFramePr>
+                  <a:graphic xmlns:a="http://schemas.openxmlformats.org/drawingml/2006/main">
+                    <a:graphicData uri="http://schemas.openxmlformats.org/drawingml/2006/picture">
+                      <pic:pic xmlns:pic="http://schemas.openxmlformats.org/drawingml/2006/picture">
+                        <pic:nvPicPr>
+                          <pic:cNvPr id="0" name="Imagen 3"/>
+                          <pic:cNvPicPr>
+                            <a:picLocks noChangeAspect="1" noChangeArrowheads="1"/>
+                          </pic:cNvPicPr>
+                        </pic:nvPicPr>
+                        <pic:blipFill>
+                          <a:blip r:embed="rId9">
+                            <a:extLst>
+                              <a:ext uri="{28A0092B-C50C-407E-A947-70E740481C1C}">
+                                <a14:useLocalDpi xmlns:a14="http://schemas.microsoft.com/office/drawing/2010/main" val="0"/>
+                              </a:ext>
+                            </a:extLst>
+                          </a:blip>
+                          <a:srcRect/>
+                          <a:stretch>
+                            <a:fillRect/>
+                          </a:stretch>
+                        </pic:blipFill>
+                        <pic:spPr bwMode="auto">
+                          <a:xfrm>
+                            <a:off x="0" y="0"/>
+                            <a:ext cx="1371600" cy="438150"/>
+                          </a:xfrm>
+                          <a:prstGeom prst="rect">
+                            <a:avLst/>
+                          </a:prstGeom>
+                          <a:noFill/>
+                        </pic:spPr>
+                      </pic:pic>
+                    </a:graphicData>
+                  </a:graphic>
+                  <wp14:sizeRelH relativeFrom="page">
+                    <wp14:pctWidth>0</wp14:pctWidth>
+                  </wp14:sizeRelH>
+                  <wp14:sizeRelV relativeFrom="page">
+                    <wp14:pctHeight>0</wp14:pctHeight>
+                  </wp14:sizeRelV>
+                </wp:anchor>
+              </w:drawing>
+            </w:r>
+            <w:r>
+              <w:rPr>
+                <w:rFonts w:ascii="Arial" w:eastAsia="BatangChe" w:hAnsi="Arial" w:cs="Arial"/>
+                <w:sz w:val="20"/>
+                <w:szCs w:val="20"/>
+              </w:rPr>
+              <w:t>UNIDAD EDU</w:t>
+            </w:r>
+            <w:r>
+              <w:rPr>
+                <w:rFonts w:ascii="Arial" w:eastAsia="BatangChe" w:hAnsi="Arial" w:cs="Arial"/>
+                <w:sz w:val="20"/>
+                <w:szCs w:val="20"/>
+              </w:rPr>
+              <w:t>C</w:t>
+            </w:r>
+            <w:r>
+              <w:rPr>
+                <w:rFonts w:ascii="Arial" w:eastAsia="BatangChe" w:hAnsi="Arial" w:cs="Arial"/>
+                <w:sz w:val="20"/>
+                <w:szCs w:val="20"/>
+              </w:rPr>
+              <w:t>ATIVA FISCOMISIONAL FE Y ALEGRÍA</w:t>
+            </w:r>
+          </w:p>
+          <w:p>
+            <w:pPr>
+              <w:pStyle w:val="Sinespaciado"/>
+              <w:jc w:val="center"/>
+              <w:rPr>
+                <w:rFonts w:ascii="Arial" w:eastAsia="BatangChe" w:hAnsi="Arial" w:cs="Arial"/>
+                <w:sz w:val="20"/>
+                <w:szCs w:val="20"/>
+              </w:rPr>
+            </w:pPr>
+            <w:r>
+              <w:rPr>
+                <w:rFonts w:ascii="Arial" w:eastAsia="BatangChe" w:hAnsi="Arial" w:cs="Arial"/>
+                <w:b/>
+                <w:sz w:val="20"/>
+                <w:szCs w:val="20"/>
+              </w:rPr>
+              <w:t>“LA DOLOROSA”</w:t>
+            </w:r>
+          </w:p>
+          <w:p>
+            <w:pPr>
+              <w:pStyle w:val="Sinespaciado"/>
+              <w:jc w:val="center"/>
+              <w:rPr>
+                <w:rFonts w:ascii="Arial" w:hAnsi="Arial" w:cs="Arial"/>
+                <w:bCs/>
+                <w:i/>
+                <w:sz w:val="20"/>
+                <w:szCs w:val="20"/>
+              </w:rPr>
+            </w:pPr>
+            <w:r>
+              <w:rPr>
+                <w:rFonts w:ascii="Arial" w:hAnsi="Arial" w:cs="Arial"/>
+                <w:bCs/>
+                <w:i/>
+                <w:sz w:val="20"/>
+                <w:szCs w:val="20"/>
+              </w:rPr>
+              <w:t>“Ser más para servir mejor”</w:t>
+            </w:r>
+          </w:p>
+          <w:p>
+            <w:pPr>
+              <w:pStyle w:val="Sinespaciado"/>
+              <w:jc w:val="center"/>
+              <w:rPr>
+                <w:rFonts w:ascii="Arial" w:hAnsi="Arial" w:cs="Arial"/>
+                <w:bCs/>
+                <w:i/>
+                <w:sz w:val="20"/>
+                <w:szCs w:val="20"/>
+              </w:rPr>
+            </w:pPr>
+            <w:r>
+              <w:rPr>
+                <w:rFonts w:ascii="Arial" w:hAnsi="Arial" w:cs="Arial"/>
+                <w:bCs/>
+                <w:i/>
+                <w:sz w:val="20"/>
+                <w:szCs w:val="20"/>
+              </w:rPr>
+              <w:t>TRIMEMESTRE N</w:t>
+            </w:r>
+            <w:r>
+              <w:rPr>
+                <w:rFonts w:ascii="Arial" w:hAnsi="Arial" w:cs="Arial"/>
+                <w:bCs/>
+                <w:i/>
+                <w:sz w:val="20"/>
+                <w:szCs w:val="20"/>
+              </w:rPr>
+              <w:t>°</w:t>
+            </w:r>
+            <w:r>
+              <w:rPr>
+                <w:rFonts w:ascii="Arial" w:hAnsi="Arial" w:cs="Arial"/>
+                <w:bCs/>
+                <w:i/>
+                <w:sz w:val="20"/>
+                <w:szCs w:val="20"/>
+              </w:rPr>
+              <w:t xml:space="preserve"> </w:t>
+            </w:r>
+            <w:r>
+              <w:rPr>
+                <w:rFonts w:ascii="Arial" w:hAnsi="Arial" w:cs="Arial"/>
+                <w:bCs/>
+                <w:i/>
+                <w:sz w:val="20"/>
+                <w:szCs w:val="20"/>
+              </w:rPr>
+              <w:t>3</w:t>
+            </w:r>
+          </w:p>
+          <w:p>
+            <w:pPr>
+              <w:pStyle w:val="Sinespaciado"/>
+              <w:jc w:val="center"/>
+              <w:rPr>
+                <w:rFonts w:ascii="Arial" w:hAnsi="Arial" w:cs="Arial"/>
+                <w:sz w:val="20"/>
+                <w:szCs w:val="20"/>
+              </w:rPr>
+            </w:pPr>
+          </w:p>
+        </w:tc>
+      </w:tr>
+      <w:tr>
+        <w:trPr>
+          <w:trHeight w:val="252"/>
+        </w:trPr>
+        <w:tc>
+          <w:tcPr>
+            <w:tcW w:w="15021" w:type="dxa"/>
+            <w:gridSpan w:val="32"/>
+          </w:tcPr>
+          <w:p>
+            <w:pPr>
+              <w:pStyle w:val="Sinespaciado"/>
+              <w:jc w:val="center"/>
+              <w:rPr>
+                <w:rFonts w:ascii="Arial" w:hAnsi="Arial" w:cs="Arial"/>
+                <w:b/>
+                <w:bCs/>
+                <w:noProof/>
+                <w:sz w:val="20"/>
+                <w:szCs w:val="20"/>
+                <w:lang w:eastAsia="es-EC"/>
+              </w:rPr>
+            </w:pPr>
+            <w:r>
+              <w:rPr>
+                <w:rFonts w:ascii="Arial" w:hAnsi="Arial" w:cs="Arial"/>
+                <w:b/>
+                <w:bCs/>
+                <w:noProof/>
+                <w:sz w:val="20"/>
+                <w:szCs w:val="20"/>
+                <w:lang w:eastAsia="es-EC"/>
+              </w:rPr>
+              <w:t>PLANIFICACIÓN UNIDAD DE TRABAJO</w:t>
+            </w:r>
+            <w:r>
+              <w:rPr>
+                <w:rFonts w:ascii="Arial" w:hAnsi="Arial" w:cs="Arial"/>
+                <w:lang w:val="es-EC"/>
+              </w:rPr>
+              <w:t>{{numero_trimestre}}</w:t>
+            </w:r>
+          </w:p>
+        </w:tc>
+      </w:tr>
+      <w:tr>
+        <w:trPr>
+          <w:trHeight w:val="252"/>
+        </w:trPr>
+        <w:tc>
+          <w:tcPr>
+            <w:tcW w:w="15021" w:type="dxa"/>
+            <w:gridSpan w:val="32"/>
+            <w:shd w:val="clear" w:color="auto" w:fill="D0CECE" w:themeFill="background2" w:themeFillShade="E6"/>
+          </w:tcPr>
+          <w:p>
+            <w:pPr>
+              <w:pStyle w:val="Sinespaciado"/>
+              <w:rPr>
+                <w:rFonts w:ascii="Arial" w:hAnsi="Arial" w:cs="Arial"/>
+                <w:b/>
+                <w:bCs/>
+                <w:noProof/>
+                <w:sz w:val="20"/>
+                <w:szCs w:val="20"/>
+                <w:lang w:eastAsia="es-EC"/>
+              </w:rPr>
+            </w:pPr>
+            <w:r>
+              <w:rPr>
+                <w:rFonts w:ascii="Arial" w:hAnsi="Arial" w:cs="Arial"/>
+                <w:b/>
+                <w:bCs/>
+                <w:noProof/>
+                <w:sz w:val="20"/>
+                <w:szCs w:val="20"/>
+                <w:lang w:eastAsia="es-EC"/>
+              </w:rPr>
+              <w:t>1.- DATOS DE REFERENCIA</w:t>
+            </w:r>
+          </w:p>
+        </w:tc>
+      </w:tr>
+      <w:tr>
+        <w:trPr>
+          <w:trHeight w:val="252"/>
+        </w:trPr>
+        <w:tc>
+          <w:tcPr>
+            <w:tcW w:w="3384" w:type="dxa"/>
+            <w:gridSpan w:val="6"/>
+          </w:tcPr>
+          <w:p>
+            <w:pPr>
+              <w:pStyle w:val="Sinespaciado"/>
+              <w:rPr>
+                <w:rFonts w:ascii="Arial" w:hAnsi="Arial" w:cs="Arial"/>
+                <w:noProof/>
+                <w:sz w:val="20"/>
+                <w:szCs w:val="20"/>
+                <w:lang w:eastAsia="es-EC"/>
+              </w:rPr>
+            </w:pPr>
+            <w:r>
+              <w:rPr>
+                <w:rFonts w:ascii="Arial" w:eastAsiaTheme="minorHAnsi" w:hAnsi="Arial" w:cs="Arial"/>
+                <w:b/>
+                <w:bCs/>
+                <w:sz w:val="20"/>
+                <w:szCs w:val="20"/>
+              </w:rPr>
+              <w:t>FIGURA PROFESIONAL</w:t>
+            </w:r>
+          </w:p>
+        </w:tc>
+        <w:tc>
+          <w:tcPr>
+            <w:tcW w:w="11637" w:type="dxa"/>
+            <w:gridSpan w:val="26"/>
+          </w:tcPr>
+          <w:p>
+            <w:pPr>
+              <w:pStyle w:val="Sinespaciado"/>
+              <w:rPr>
+                <w:rFonts w:ascii="Arial" w:hAnsi="Arial" w:cs="Arial"/>
+                <w:noProof/>
+                <w:sz w:val="20"/>
+                <w:szCs w:val="20"/>
+                <w:lang w:eastAsia="es-EC"/>
+              </w:rPr>
+            </w:pPr>
+            <w:r>
+              <w:rPr>
+                <w:rFonts w:ascii="Arial" w:hAnsi="Arial" w:cs="Arial"/>
+                <w:noProof/>
+                <w:sz w:val="20"/>
+                <w:szCs w:val="20"/>
+                <w:lang w:eastAsia="es-EC"/>
+              </w:rPr>
+              <w:t>BACHILLERATO TÉCNICO EN INFORMÁTICA</w:t>
+            </w:r>
+            <w:r>
+              <w:rPr>
+                <w:rFonts w:ascii="Arial" w:hAnsi="Arial" w:cs="Arial"/>
+                <w:lang w:val="es-EC"/>
+              </w:rPr>
+              <w:t>{{figura_profesional}}</w:t>
+            </w:r>
+          </w:p>
+        </w:tc>
+      </w:tr>
+      <w:tr>
+        <w:trPr>
+          <w:trHeight w:val="266"/>
+        </w:trPr>
+        <w:tc>
+          <w:tcPr>
+            <w:tcW w:w="3384" w:type="dxa"/>
+            <w:gridSpan w:val="6"/>
+            <w:vAlign w:val="center"/>
+          </w:tcPr>
+          <w:p>
+            <w:pPr>
+              <w:autoSpaceDE w:val="0"/>
+              <w:autoSpaceDN w:val="0"/>
+              <w:adjustRightInd w:val="0"/>
+              <w:rPr>
+                <w:rFonts w:ascii="Arial" w:hAnsi="Arial" w:cs="Arial"/>
+                <w:b/>
+                <w:bCs/>
+                <w:sz w:val="20"/>
+                <w:szCs w:val="20"/>
+              </w:rPr>
+            </w:pPr>
+            <w:r>
+              <w:rPr>
+                <w:rFonts w:ascii="Arial" w:hAnsi="Arial" w:cs="Arial"/>
+                <w:b/>
+                <w:bCs/>
+                <w:sz w:val="20"/>
+                <w:szCs w:val="20"/>
+              </w:rPr>
+              <w:t>NOMBRE DEL DOCENTE</w:t>
+            </w:r>
+          </w:p>
+        </w:tc>
+        <w:tc>
+          <w:tcPr>
+            <w:tcW w:w="3356" w:type="dxa"/>
+            <w:gridSpan w:val="10"/>
+            <w:vAlign w:val="center"/>
+          </w:tcPr>
+          <w:p>
+            <w:pPr>
+              <w:rPr>
+                <w:rFonts w:ascii="Arial" w:hAnsi="Arial" w:cs="Arial"/>
+                <w:sz w:val="20"/>
+                <w:szCs w:val="20"/>
+              </w:rPr>
+            </w:pPr>
+            <w:r>
+              <w:rPr>
+                <w:rFonts w:ascii="Arial" w:hAnsi="Arial" w:cs="Arial"/>
+                <w:lang w:val="es-EC"/>
+              </w:rPr>
+              <w:t>{{nombre_docente}}</w:t>
+            </w:r>
+          </w:p>
+        </w:tc>
+        <w:tc>
+          <w:tcPr>
+            <w:tcW w:w="1769" w:type="dxa"/>
+            <w:gridSpan w:val="3"/>
+            <w:vAlign w:val="center"/>
+          </w:tcPr>
+          <w:p>
+            <w:pPr>
+              <w:rPr>
+                <w:rFonts w:ascii="Arial" w:hAnsi="Arial" w:cs="Arial"/>
+                <w:b/>
+                <w:sz w:val="20"/>
+                <w:szCs w:val="20"/>
+              </w:rPr>
+            </w:pPr>
+            <w:r>
+              <w:rPr>
+                <w:rFonts w:ascii="Arial" w:hAnsi="Arial" w:cs="Arial"/>
+                <w:b/>
+                <w:sz w:val="20"/>
+                <w:szCs w:val="20"/>
+              </w:rPr>
+              <w:t xml:space="preserve">FECHA DE INICIO </w:t>
+            </w:r>
+          </w:p>
+        </w:tc>
+        <w:tc>
+          <w:tcPr>
+            <w:tcW w:w="1968" w:type="dxa"/>
+            <w:gridSpan w:val="5"/>
+            <w:vAlign w:val="center"/>
+          </w:tcPr>
+          <w:p>
+            <w:pPr>
+              <w:rPr>
+                <w:rFonts w:ascii="Arial" w:hAnsi="Arial" w:cs="Arial"/>
+                <w:sz w:val="20"/>
+                <w:szCs w:val="20"/>
+              </w:rPr>
+            </w:pPr>
+            <w:r>
+              <w:rPr>
+                <w:rFonts w:ascii="Arial" w:hAnsi="Arial" w:cs="Arial"/>
+                <w:b/>
+                <w:color w:val="000000"/>
+              </w:rPr>
+              <w:t>23</w:t>
+            </w:r>
+            <w:r>
+              <w:rPr>
+                <w:rFonts w:ascii="Arial" w:hAnsi="Arial" w:cs="Arial"/>
+                <w:b/>
+                <w:color w:val="000000"/>
+              </w:rPr>
+              <w:t xml:space="preserve"> de </w:t>
+            </w:r>
+            <w:r>
+              <w:rPr>
+                <w:rFonts w:ascii="Arial" w:hAnsi="Arial" w:cs="Arial"/>
+                <w:b/>
+                <w:color w:val="000000"/>
+              </w:rPr>
+              <w:t>marzo</w:t>
+            </w:r>
+            <w:r>
+              <w:rPr>
+                <w:rFonts w:ascii="Arial" w:hAnsi="Arial" w:cs="Arial"/>
+                <w:b/>
+                <w:color w:val="000000"/>
+              </w:rPr>
+              <w:t xml:space="preserve"> del 202</w:t>
+            </w:r>
+            <w:r>
+              <w:rPr>
+                <w:rFonts w:ascii="Arial" w:hAnsi="Arial" w:cs="Arial"/>
+                <w:b/>
+                <w:color w:val="000000"/>
+              </w:rPr>
+              <w:t>6</w:t>
+            </w:r>
+            <w:r>
+              <w:rPr>
+                <w:rFonts w:ascii="Arial" w:hAnsi="Arial" w:cs="Arial"/>
+                <w:lang w:val="es-EC"/>
+              </w:rPr>
+              <w:t>{{fecha_inicio}}</w:t>
+            </w:r>
+          </w:p>
+        </w:tc>
+        <w:tc>
+          <w:tcPr>
+            <w:tcW w:w="2410" w:type="dxa"/>
+            <w:gridSpan w:val="5"/>
+            <w:vAlign w:val="center"/>
+          </w:tcPr>
+          <w:p>
+            <w:pPr>
+              <w:rPr>
+                <w:rFonts w:ascii="Arial" w:hAnsi="Arial" w:cs="Arial"/>
+                <w:b/>
+                <w:sz w:val="20"/>
+                <w:szCs w:val="20"/>
+              </w:rPr>
+            </w:pPr>
+            <w:r>
+              <w:rPr>
+                <w:rFonts w:ascii="Arial" w:hAnsi="Arial" w:cs="Arial"/>
+                <w:b/>
+                <w:sz w:val="20"/>
+                <w:szCs w:val="20"/>
+              </w:rPr>
+              <w:t xml:space="preserve">FECHA DE FINALIZACIÓN </w:t>
+            </w:r>
+          </w:p>
+        </w:tc>
+        <w:tc>
+          <w:tcPr>
+            <w:tcW w:w="2134" w:type="dxa"/>
+            <w:gridSpan w:val="3"/>
+            <w:vAlign w:val="center"/>
+          </w:tcPr>
+          <w:p>
+            <w:pPr>
+              <w:rPr>
+                <w:rFonts w:ascii="Arial" w:hAnsi="Arial" w:cs="Arial"/>
+                <w:b/>
+                <w:color w:val="000000"/>
+              </w:rPr>
+            </w:pPr>
+            <w:r>
+              <w:rPr>
+                <w:rFonts w:ascii="Arial" w:hAnsi="Arial" w:cs="Arial"/>
+                <w:b/>
+                <w:color w:val="000000"/>
+              </w:rPr>
+              <w:t>12 de junio del 2026</w:t>
+            </w:r>
+            <w:r>
+              <w:rPr>
+                <w:rFonts w:ascii="Arial" w:hAnsi="Arial" w:cs="Arial"/>
+                <w:lang w:val="es-EC"/>
+              </w:rPr>
+              <w:t>{{fecha_fin}}</w:t>
+            </w:r>
+          </w:p>
+          <w:p>
+            <w:pPr>
+              <w:rPr>
+                <w:rFonts w:ascii="Arial" w:hAnsi="Arial" w:cs="Arial"/>
+                <w:sz w:val="20"/>
+                <w:szCs w:val="20"/>
+              </w:rPr>
+            </w:pPr>
+            <w:r>
+              <w:rPr>
+                <w:rFonts w:ascii="Arial" w:hAnsi="Arial" w:cs="Arial"/>
+                <w:b/>
+                <w:color w:val="000000"/>
+              </w:rPr>
+              <w:t>30 de abril del 2026 para 3º BT</w:t>
+            </w:r>
+          </w:p>
+        </w:tc>
+      </w:tr>
+      <w:tr>
+        <w:trPr>
+          <w:trHeight w:val="266"/>
+        </w:trPr>
+        <w:tc>
+          <w:tcPr>
+            <w:tcW w:w="3384" w:type="dxa"/>
+            <w:gridSpan w:val="6"/>
+          </w:tcPr>
+          <w:p>
+            <w:pPr>
+              <w:autoSpaceDE w:val="0"/>
+              <w:autoSpaceDN w:val="0"/>
+              <w:adjustRightInd w:val="0"/>
+              <w:rPr>
+                <w:rFonts w:ascii="Arial" w:hAnsi="Arial" w:cs="Arial"/>
+                <w:sz w:val="20"/>
+                <w:szCs w:val="20"/>
+              </w:rPr>
+            </w:pPr>
+            <w:r>
+              <w:rPr>
+                <w:rFonts w:ascii="Arial" w:hAnsi="Arial" w:cs="Arial"/>
+                <w:b/>
+                <w:bCs/>
+                <w:sz w:val="20"/>
+                <w:szCs w:val="20"/>
+              </w:rPr>
+              <w:t xml:space="preserve">ÁREA </w:t>
+            </w:r>
+          </w:p>
+        </w:tc>
+        <w:tc>
+          <w:tcPr>
+            <w:tcW w:w="3356" w:type="dxa"/>
+            <w:gridSpan w:val="10"/>
+          </w:tcPr>
+          <w:p>
+            <w:pPr>
+              <w:jc w:val="both"/>
+              <w:rPr>
+                <w:rFonts w:ascii="Arial" w:hAnsi="Arial" w:cs="Arial"/>
+                <w:sz w:val="20"/>
+                <w:szCs w:val="20"/>
+              </w:rPr>
+            </w:pPr>
+            <w:r>
+              <w:rPr>
+                <w:rFonts w:ascii="Arial" w:hAnsi="Arial" w:cs="Arial"/>
+                <w:sz w:val="20"/>
+                <w:szCs w:val="20"/>
+              </w:rPr>
+              <w:t>INFORMÁTICA</w:t>
+            </w:r>
+            <w:r>
+              <w:rPr>
+                <w:rFonts w:ascii="Arial" w:hAnsi="Arial" w:cs="Arial"/>
+                <w:lang w:val="es-EC"/>
+              </w:rPr>
+              <w:t>{{area}}</w:t>
+            </w:r>
+          </w:p>
+        </w:tc>
+        <w:tc>
+          <w:tcPr>
+            <w:tcW w:w="1769" w:type="dxa"/>
+            <w:gridSpan w:val="3"/>
+          </w:tcPr>
+          <w:p>
+            <w:pPr>
+              <w:rPr>
+                <w:rFonts w:ascii="Arial" w:hAnsi="Arial" w:cs="Arial"/>
+                <w:b/>
+                <w:sz w:val="20"/>
+                <w:szCs w:val="20"/>
+              </w:rPr>
+            </w:pPr>
+            <w:r>
+              <w:rPr>
+                <w:rFonts w:ascii="Arial" w:hAnsi="Arial" w:cs="Arial"/>
+                <w:b/>
+                <w:bCs/>
+                <w:sz w:val="20"/>
+                <w:szCs w:val="20"/>
+              </w:rPr>
+              <w:t>CURSO</w:t>
+            </w:r>
+          </w:p>
+        </w:tc>
+        <w:tc>
+          <w:tcPr>
+            <w:tcW w:w="1968" w:type="dxa"/>
+            <w:gridSpan w:val="5"/>
+            <w:vAlign w:val="center"/>
+          </w:tcPr>
+          <w:p>
+            <w:pPr>
+              <w:rPr>
+                <w:rFonts w:ascii="Arial" w:hAnsi="Arial" w:cs="Arial"/>
+                <w:sz w:val="20"/>
+                <w:szCs w:val="20"/>
+              </w:rPr>
+            </w:pPr>
+            <w:r>
+              <w:rPr>
+                <w:rFonts w:ascii="Arial" w:hAnsi="Arial" w:cs="Arial"/>
+                <w:lang w:val="es-EC"/>
+              </w:rPr>
+              <w:t>{{curso}}</w:t>
+            </w:r>
+          </w:p>
+        </w:tc>
+        <w:tc>
+          <w:tcPr>
+            <w:tcW w:w="2410" w:type="dxa"/>
+            <w:gridSpan w:val="5"/>
+          </w:tcPr>
+          <w:p>
+            <w:pPr>
+              <w:rPr>
+                <w:rFonts w:ascii="Arial" w:hAnsi="Arial" w:cs="Arial"/>
+                <w:b/>
+                <w:sz w:val="20"/>
+                <w:szCs w:val="20"/>
+              </w:rPr>
+            </w:pPr>
+            <w:r>
+              <w:rPr>
+                <w:rFonts w:ascii="Arial" w:hAnsi="Arial" w:cs="Arial"/>
+                <w:b/>
+                <w:sz w:val="20"/>
+                <w:szCs w:val="20"/>
+              </w:rPr>
+              <w:t xml:space="preserve">AÑO LECTIVO </w:t>
+            </w:r>
+          </w:p>
+        </w:tc>
+        <w:tc>
+          <w:tcPr>
+            <w:tcW w:w="2134" w:type="dxa"/>
+            <w:gridSpan w:val="3"/>
+            <w:vAlign w:val="center"/>
+          </w:tcPr>
+          <w:p>
+            <w:pPr>
+              <w:rPr>
+                <w:rFonts w:ascii="Arial" w:hAnsi="Arial" w:cs="Arial"/>
+                <w:sz w:val="20"/>
+                <w:szCs w:val="20"/>
+              </w:rPr>
+            </w:pPr>
+            <w:r>
+              <w:rPr>
+                <w:rFonts w:ascii="Arial" w:hAnsi="Arial" w:cs="Arial"/>
+                <w:lang w:val="es-EC"/>
+              </w:rPr>
+              <w:t>{{año_lectivo}}</w:t>
+            </w:r>
+          </w:p>
+        </w:tc>
+      </w:tr>
+      <w:tr>
+        <w:trPr>
+          <w:trHeight w:val="252"/>
+        </w:trPr>
+        <w:tc>
+          <w:tcPr>
+            <w:tcW w:w="3384" w:type="dxa"/>
+            <w:gridSpan w:val="6"/>
+          </w:tcPr>
+          <w:p>
+            <w:pPr>
+              <w:autoSpaceDE w:val="0"/>
+              <w:autoSpaceDN w:val="0"/>
+              <w:adjustRightInd w:val="0"/>
+              <w:rPr>
+                <w:rFonts w:ascii="Arial" w:hAnsi="Arial" w:cs="Arial"/>
+                <w:b/>
+                <w:bCs/>
+                <w:sz w:val="20"/>
+                <w:szCs w:val="20"/>
+              </w:rPr>
+            </w:pPr>
+            <w:r>
+              <w:rPr>
+                <w:rFonts w:ascii="Arial" w:hAnsi="Arial" w:cs="Arial"/>
+                <w:b/>
+                <w:bCs/>
+                <w:sz w:val="20"/>
+                <w:szCs w:val="20"/>
+              </w:rPr>
+              <w:t>NOMBRE DEL MÓDULO FORMATIVO</w:t>
+            </w:r>
+          </w:p>
+        </w:tc>
+        <w:tc>
+          <w:tcPr>
+            <w:tcW w:w="3356" w:type="dxa"/>
+            <w:gridSpan w:val="10"/>
+            <w:vAlign w:val="center"/>
+          </w:tcPr>
+          <w:p>
+            <w:pPr>
+              <w:rPr>
+                <w:rFonts w:ascii="Arial" w:hAnsi="Arial" w:cs="Arial"/>
+                <w:sz w:val="20"/>
+                <w:szCs w:val="20"/>
+              </w:rPr>
+            </w:pPr>
+            <w:r>
+              <w:rPr>
+                <w:rFonts w:ascii="Arial" w:hAnsi="Arial" w:cs="Arial"/>
+                <w:lang w:val="es-EC"/>
+              </w:rPr>
+              <w:t>{{nombre_modulo}}</w:t>
+            </w:r>
+          </w:p>
+        </w:tc>
+        <w:tc>
+          <w:tcPr>
+            <w:tcW w:w="1769" w:type="dxa"/>
+            <w:gridSpan w:val="3"/>
+          </w:tcPr>
+          <w:p>
+            <w:pPr>
+              <w:autoSpaceDE w:val="0"/>
+              <w:autoSpaceDN w:val="0"/>
+              <w:adjustRightInd w:val="0"/>
+              <w:rPr>
+                <w:rFonts w:ascii="Arial" w:hAnsi="Arial" w:cs="Arial"/>
+                <w:b/>
+                <w:bCs/>
+                <w:sz w:val="20"/>
+                <w:szCs w:val="20"/>
+              </w:rPr>
+            </w:pPr>
+            <w:r>
+              <w:rPr>
+                <w:rFonts w:ascii="Arial" w:hAnsi="Arial" w:cs="Arial"/>
+                <w:b/>
+                <w:bCs/>
+                <w:sz w:val="20"/>
+                <w:szCs w:val="20"/>
+              </w:rPr>
+              <w:t>N° DE HORAS</w:t>
+            </w:r>
+          </w:p>
+          <w:p>
+            <w:pPr>
+              <w:rPr>
+                <w:rFonts w:ascii="Arial" w:hAnsi="Arial" w:cs="Arial"/>
+                <w:b/>
+                <w:sz w:val="20"/>
+                <w:szCs w:val="20"/>
+              </w:rPr>
+            </w:pPr>
+            <w:r>
+              <w:rPr>
+                <w:rFonts w:ascii="Arial" w:hAnsi="Arial" w:cs="Arial"/>
+                <w:b/>
+                <w:bCs/>
+                <w:sz w:val="20"/>
+                <w:szCs w:val="20"/>
+              </w:rPr>
+              <w:t>PEDAGÓGICAS</w:t>
+            </w:r>
+          </w:p>
+        </w:tc>
+        <w:tc>
+          <w:tcPr>
+            <w:tcW w:w="6512" w:type="dxa"/>
+            <w:gridSpan w:val="13"/>
+            <w:vAlign w:val="center"/>
+          </w:tcPr>
+          <w:p>
+            <w:pPr>
+              <w:rPr>
+                <w:rFonts w:ascii="Arial" w:hAnsi="Arial" w:cs="Arial"/>
+                <w:sz w:val="20"/>
+                <w:szCs w:val="20"/>
+              </w:rPr>
+            </w:pPr>
+            <w:r>
+              <w:rPr>
+                <w:rFonts w:ascii="Arial" w:hAnsi="Arial" w:cs="Arial"/>
+                <w:lang w:val="es-EC"/>
+              </w:rPr>
+              <w:t>{{num_horas}}</w:t>
+            </w:r>
+          </w:p>
+        </w:tc>
+      </w:tr>
+      <w:tr>
+        <w:trPr>
+          <w:trHeight w:val="266"/>
+        </w:trPr>
+        <w:tc>
+          <w:tcPr>
+            <w:tcW w:w="3384" w:type="dxa"/>
+            <w:gridSpan w:val="6"/>
+          </w:tcPr>
+          <w:p>
+            <w:pPr>
+              <w:autoSpaceDE w:val="0"/>
+              <w:autoSpaceDN w:val="0"/>
+              <w:adjustRightInd w:val="0"/>
+              <w:rPr>
+                <w:rFonts w:ascii="Arial" w:hAnsi="Arial" w:cs="Arial"/>
+                <w:b/>
+                <w:bCs/>
+                <w:sz w:val="20"/>
+                <w:szCs w:val="20"/>
+              </w:rPr>
+            </w:pPr>
+            <w:r>
+              <w:rPr>
+                <w:rFonts w:ascii="Arial" w:hAnsi="Arial" w:cs="Arial"/>
+                <w:b/>
+                <w:bCs/>
+                <w:sz w:val="20"/>
+                <w:szCs w:val="20"/>
+              </w:rPr>
+              <w:t>OBJETIVO DE</w:t>
+            </w:r>
+            <w:r>
+              <w:rPr>
+                <w:rFonts w:ascii="Arial" w:hAnsi="Arial" w:cs="Arial"/>
+                <w:b/>
+                <w:bCs/>
+                <w:sz w:val="20"/>
+                <w:szCs w:val="20"/>
+              </w:rPr>
+              <w:t>L MÓDULO FORMATIVO</w:t>
+            </w:r>
+          </w:p>
+        </w:tc>
+        <w:tc>
+          <w:tcPr>
+            <w:tcW w:w="11637" w:type="dxa"/>
+            <w:gridSpan w:val="26"/>
+            <w:vAlign w:val="center"/>
+          </w:tcPr>
+          <w:p>
+            <w:pPr>
+              <w:tabs>
+                <w:tab w:val="left" w:pos="924"/>
+              </w:tabs>
+              <w:autoSpaceDE w:val="0"/>
+              <w:autoSpaceDN w:val="0"/>
+              <w:adjustRightInd w:val="0"/>
+              <w:rPr>
+                <w:rFonts w:ascii="Arial" w:hAnsi="Arial" w:cs="Arial"/>
+                <w:bCs/>
+                <w:sz w:val="20"/>
+                <w:szCs w:val="20"/>
+              </w:rPr>
+            </w:pPr>
+            <w:r>
+              <w:rPr>
+                <w:rFonts w:ascii="Arial" w:hAnsi="Arial" w:cs="Arial"/>
+                <w:lang w:val="es-EC"/>
+              </w:rPr>
+              <w:t>{{objetivo_modulo}}</w:t>
+            </w:r>
+          </w:p>
+        </w:tc>
+      </w:tr>
+      <w:tr>
+        <w:trPr>
+          <w:trHeight w:val="252"/>
+        </w:trPr>
+        <w:tc>
+          <w:tcPr>
+            <w:tcW w:w="3384" w:type="dxa"/>
+            <w:gridSpan w:val="6"/>
+          </w:tcPr>
+          <w:p>
+            <w:pPr>
+              <w:rPr>
+                <w:rFonts w:ascii="Arial" w:hAnsi="Arial" w:cs="Arial"/>
+                <w:sz w:val="20"/>
+                <w:szCs w:val="20"/>
+              </w:rPr>
+            </w:pPr>
+            <w:r>
+              <w:rPr>
+                <w:rFonts w:ascii="Arial" w:hAnsi="Arial" w:cs="Arial"/>
+                <w:b/>
+                <w:bCs/>
+                <w:sz w:val="20"/>
+                <w:szCs w:val="20"/>
+              </w:rPr>
+              <w:t>N° Y NOMBRE DE LA UNIDAD DE TRABAJO</w:t>
+            </w:r>
+          </w:p>
+        </w:tc>
+        <w:tc>
+          <w:tcPr>
+            <w:tcW w:w="11637" w:type="dxa"/>
+            <w:gridSpan w:val="26"/>
+            <w:vAlign w:val="center"/>
+          </w:tcPr>
+          <w:p>
+            <w:pPr>
+              <w:pStyle w:val="Default"/>
+              <w:rPr>
+                <w:rFonts w:ascii="Arial" w:hAnsi="Arial" w:cs="Arial"/>
+                <w:sz w:val="20"/>
+                <w:szCs w:val="20"/>
+              </w:rPr>
+            </w:pPr>
+            <w:r>
+              <w:rPr>
+                <w:rFonts w:ascii="Arial" w:hAnsi="Arial" w:cs="Arial"/>
+                <w:lang w:val="es-EC"/>
+              </w:rPr>
+              <w:t>{{nombre_unidad_trabajo}}</w:t>
+            </w:r>
+          </w:p>
+        </w:tc>
+      </w:tr>
+      <w:tr>
+        <w:trPr>
+          <w:trHeight w:val="496"/>
+        </w:trPr>
+        <w:tc>
+          <w:tcPr>
+            <w:tcW w:w="3384" w:type="dxa"/>
+            <w:gridSpan w:val="6"/>
+          </w:tcPr>
+          <w:p>
+            <w:pPr>
+              <w:rPr>
+                <w:rFonts w:ascii="Arial" w:hAnsi="Arial" w:cs="Arial"/>
+                <w:b/>
+                <w:bCs/>
+                <w:sz w:val="20"/>
+                <w:szCs w:val="20"/>
+              </w:rPr>
+            </w:pPr>
+            <w:r>
+              <w:rPr>
+                <w:rFonts w:ascii="Arial" w:hAnsi="Arial" w:cs="Arial"/>
+                <w:b/>
+                <w:bCs/>
+                <w:sz w:val="20"/>
+                <w:szCs w:val="20"/>
+              </w:rPr>
+              <w:t>OBJETIVO DE LA UNIDAD DE TRABAJO</w:t>
+            </w:r>
+          </w:p>
+        </w:tc>
+        <w:tc>
+          <w:tcPr>
+            <w:tcW w:w="11637" w:type="dxa"/>
+            <w:gridSpan w:val="26"/>
+            <w:vAlign w:val="center"/>
+          </w:tcPr>
+          <w:p>
+            <w:pPr>
+              <w:pStyle w:val="Default"/>
+              <w:rPr>
+                <w:rFonts w:ascii="Arial" w:hAnsi="Arial" w:cs="Arial"/>
+                <w:sz w:val="23"/>
+                <w:szCs w:val="23"/>
+              </w:rPr>
+            </w:pPr>
+            <w:r>
+              <w:rPr>
+                <w:rFonts w:ascii="Arial" w:hAnsi="Arial" w:cs="Arial"/>
+                <w:lang w:val="es-EC"/>
+              </w:rPr>
+              <w:t>{{objetivo_unidad_trabajo}}</w:t>
+            </w:r>
+          </w:p>
+        </w:tc>
+      </w:tr>
+      <w:tr>
+        <w:trPr>
+          <w:trHeight w:val="764"/>
+        </w:trPr>
+        <w:tc>
+          <w:tcPr>
+            <w:tcW w:w="3384" w:type="dxa"/>
+            <w:gridSpan w:val="6"/>
+            <w:vAlign w:val="center"/>
+          </w:tcPr>
+          <w:p>
+            <w:pPr>
+              <w:rPr>
+                <w:rFonts w:ascii="Arial" w:hAnsi="Arial" w:cs="Arial"/>
+                <w:b/>
+                <w:bCs/>
+                <w:color w:val="000000"/>
+                <w:sz w:val="20"/>
+                <w:szCs w:val="20"/>
+                <w:lang w:eastAsia="es-EC"/>
+              </w:rPr>
+            </w:pPr>
+            <w:r>
+              <w:rPr>
+                <w:rFonts w:ascii="Arial" w:hAnsi="Arial" w:cs="Arial"/>
+                <w:b/>
+                <w:bCs/>
+                <w:color w:val="000000"/>
+                <w:sz w:val="20"/>
+                <w:szCs w:val="20"/>
+                <w:lang w:eastAsia="es-EC"/>
+              </w:rPr>
+              <w:t xml:space="preserve">EJES TRANSVERSALES </w:t>
+            </w:r>
+          </w:p>
+        </w:tc>
+        <w:tc>
+          <w:tcPr>
+            <w:tcW w:w="5697" w:type="dxa"/>
+            <w:gridSpan w:val="14"/>
+            <w:vAlign w:val="center"/>
+          </w:tcPr>
+          <w:p>
+            <w:pPr>
+              <w:pStyle w:val="Sinespaciado"/>
+              <w:rPr>
+                <w:rFonts w:ascii="Arial" w:hAnsi="Arial" w:cs="Arial"/>
+                <w:b/>
+                <w:bCs/>
+                <w:color w:val="000000"/>
+                <w:sz w:val="20"/>
+                <w:szCs w:val="20"/>
+                <w:lang w:eastAsia="es-EC"/>
+              </w:rPr>
+            </w:pPr>
+            <w:r>
+              <w:rPr>
+                <w:rFonts w:ascii="Arial" w:hAnsi="Arial" w:cs="Arial"/>
+                <w:lang w:val="es-EC"/>
+              </w:rPr>
+              <w:t>{{ejes_transversales}}</w:t>
+            </w:r>
+          </w:p>
+          <w:p>
+            <w:pPr>
+              <w:pStyle w:val="Sinespaciado"/>
+              <w:rPr>
+                <w:rFonts w:ascii="Arial" w:hAnsi="Arial" w:cs="Arial"/>
+                <w:b/>
+                <w:bCs/>
+                <w:color w:val="000000"/>
+                <w:sz w:val="20"/>
+                <w:szCs w:val="20"/>
+                <w:lang w:eastAsia="es-EC"/>
+              </w:rPr>
+            </w:pPr>
+          </w:p>
+        </w:tc>
+        <w:tc>
+          <w:tcPr>
+            <w:tcW w:w="5940" w:type="dxa"/>
+            <w:gridSpan w:val="12"/>
+            <w:vAlign w:val="center"/>
+          </w:tcPr>
+          <w:p>
+            <w:pPr>
+              <w:pStyle w:val="Sinespaciado"/>
+              <w:rPr>
+                <w:rFonts w:ascii="Arial" w:hAnsi="Arial" w:cs="Arial"/>
+                <w:b/>
+                <w:bCs/>
+                <w:color w:val="000000"/>
+                <w:sz w:val="20"/>
+                <w:szCs w:val="20"/>
+                <w:lang w:eastAsia="es-EC"/>
+              </w:rPr>
+            </w:pPr>
+            <w:r>
+              <w:rPr>
+                <w:rFonts w:ascii="Arial" w:hAnsi="Arial" w:cs="Arial"/>
+                <w:noProof/>
+              </w:rPr>
+              <w:drawing>
+                <wp:inline distT="0" distB="0" distL="0" distR="0" wp14:anchorId="561E64E3" wp14:editId="0B04016C">
+                  <wp:extent cx="2951264" cy="619146"/>
+                  <wp:effectExtent l="0" t="0" r="0" b="3175"/>
+                  <wp:docPr id="1215330430" name="Imagen 1"/>
+                  <wp:cNvGraphicFramePr>
+                    <a:graphicFrameLocks xmlns:a="http://schemas.openxmlformats.org/drawingml/2006/main" noChangeAspect="1"/>
+                  </wp:cNvGraphicFramePr>
+                  <a:graphic xmlns:a="http://schemas.openxmlformats.org/drawingml/2006/main">
+                    <a:graphicData uri="http://schemas.openxmlformats.org/drawingml/2006/picture">
+                      <pic:pic xmlns:pic="http://schemas.openxmlformats.org/drawingml/2006/picture">
+                        <pic:nvPicPr>
+                          <pic:cNvPr id="1215330430" name=""/>
+                          <pic:cNvPicPr/>
+                        </pic:nvPicPr>
+                        <pic:blipFill>
+                          <a:blip r:embed="rId10"/>
+                          <a:stretch>
+                            <a:fillRect/>
+                          </a:stretch>
+                        </pic:blipFill>
+                        <pic:spPr>
+                          <a:xfrm>
+                            <a:off x="0" y="0"/>
+                            <a:ext cx="2961030" cy="621195"/>
+                          </a:xfrm>
+                          <a:prstGeom prst="rect">
+                            <a:avLst/>
+                          </a:prstGeom>
+                        </pic:spPr>
+                      </pic:pic>
+                    </a:graphicData>
+                  </a:graphic>
+                </wp:inline>
+              </w:drawing>
+            </w:r>
+          </w:p>
+        </w:tc>
+      </w:tr>
+      <w:tr>
+        <w:trPr>
+          <w:trHeight w:val="252"/>
+        </w:trPr>
+        <w:tc>
+          <w:tcPr>
+            <w:tcW w:w="15021" w:type="dxa"/>
+            <w:gridSpan w:val="32"/>
+            <w:shd w:val="clear" w:color="auto" w:fill="D0CECE" w:themeFill="background2" w:themeFillShade="E6"/>
+            <w:vAlign w:val="center"/>
+          </w:tcPr>
+          <w:p>
+            <w:pPr>
+              <w:rPr>
+                <w:rFonts w:ascii="Arial" w:hAnsi="Arial" w:cs="Arial"/>
+                <w:b/>
+                <w:bCs/>
+                <w:color w:val="000000"/>
+                <w:sz w:val="20"/>
+                <w:szCs w:val="20"/>
+                <w:lang w:eastAsia="es-EC"/>
+              </w:rPr>
+            </w:pPr>
+            <w:r>
+              <w:rPr>
+                <w:rFonts w:ascii="Arial" w:hAnsi="Arial" w:cs="Arial"/>
+                <w:b/>
+                <w:bCs/>
+                <w:sz w:val="20"/>
+                <w:szCs w:val="20"/>
+              </w:rPr>
+              <w:t>2.- DESARROLLO DE LA UNIDAD DE TRABAJO</w:t>
+            </w:r>
+          </w:p>
+        </w:tc>
+      </w:tr>
+      <w:tr>
+        <w:trPr>
+          <w:trHeight w:val="189"/>
+        </w:trPr>
+        <w:tc>
+          <w:tcPr>
+            <w:tcW w:w="6197" w:type="dxa"/>
+            <w:gridSpan w:val="12"/>
+          </w:tcPr>
+          <w:p>
+            <w:pPr>
+              <w:autoSpaceDE w:val="0"/>
+              <w:autoSpaceDN w:val="0"/>
+              <w:adjustRightInd w:val="0"/>
+              <w:jc w:val="center"/>
+              <w:rPr>
+                <w:rFonts w:ascii="Arial" w:hAnsi="Arial" w:cs="Arial"/>
+                <w:b/>
+                <w:bCs/>
+                <w:sz w:val="18"/>
+                <w:szCs w:val="18"/>
+              </w:rPr>
+            </w:pPr>
+            <w:r>
+              <w:rPr>
+                <w:rFonts w:ascii="Arial" w:hAnsi="Arial" w:cs="Arial"/>
+                <w:b/>
+                <w:bCs/>
+                <w:sz w:val="18"/>
+                <w:szCs w:val="18"/>
+              </w:rPr>
+              <w:t>CONTENIDOS</w:t>
+            </w:r>
+          </w:p>
+        </w:tc>
+        <w:tc>
+          <w:tcPr>
+            <w:tcW w:w="3831" w:type="dxa"/>
+            <w:gridSpan w:val="9"/>
+            <w:vMerge w:val="restart"/>
+            <w:vAlign w:val="center"/>
+          </w:tcPr>
+          <w:p>
+            <w:pPr>
+              <w:autoSpaceDE w:val="0"/>
+              <w:autoSpaceDN w:val="0"/>
+              <w:adjustRightInd w:val="0"/>
+              <w:jc w:val="center"/>
+              <w:rPr>
+                <w:rFonts w:ascii="Arial" w:hAnsi="Arial" w:cs="Arial"/>
+                <w:b/>
+                <w:bCs/>
+                <w:sz w:val="18"/>
+                <w:szCs w:val="18"/>
+              </w:rPr>
+            </w:pPr>
+            <w:r>
+              <w:rPr>
+                <w:rFonts w:ascii="Arial" w:hAnsi="Arial" w:cs="Arial"/>
+                <w:b/>
+                <w:bCs/>
+                <w:sz w:val="18"/>
+                <w:szCs w:val="18"/>
+              </w:rPr>
+              <w:t>ACTIVIDADES DE APRENDIZAJE</w:t>
+            </w:r>
+          </w:p>
+          <w:p>
+            <w:pPr>
+              <w:jc w:val="center"/>
+              <w:rPr>
+                <w:rFonts w:ascii="Arial" w:hAnsi="Arial" w:cs="Arial"/>
+                <w:b/>
+                <w:bCs/>
+                <w:sz w:val="18"/>
+                <w:szCs w:val="18"/>
+              </w:rPr>
+            </w:pPr>
+            <w:r>
+              <w:rPr>
+                <w:rFonts w:ascii="Arial" w:hAnsi="Arial" w:cs="Arial"/>
+                <w:b/>
+                <w:bCs/>
+                <w:sz w:val="18"/>
+                <w:szCs w:val="18"/>
+              </w:rPr>
+              <w:t>(Estrategias Metodológicas)</w:t>
+            </w:r>
+          </w:p>
+        </w:tc>
+        <w:tc>
+          <w:tcPr>
+            <w:tcW w:w="1843" w:type="dxa"/>
+            <w:gridSpan w:val="5"/>
+            <w:vMerge w:val="restart"/>
+            <w:vAlign w:val="center"/>
+          </w:tcPr>
+          <w:p>
+            <w:pPr>
+              <w:jc w:val="center"/>
+              <w:rPr>
+                <w:rFonts w:ascii="Arial" w:hAnsi="Arial" w:cs="Arial"/>
+                <w:b/>
+                <w:bCs/>
+                <w:sz w:val="18"/>
+                <w:szCs w:val="18"/>
+              </w:rPr>
+            </w:pPr>
+            <w:r>
+              <w:rPr>
+                <w:rFonts w:ascii="Arial" w:hAnsi="Arial" w:cs="Arial"/>
+                <w:b/>
+                <w:bCs/>
+                <w:sz w:val="18"/>
+                <w:szCs w:val="18"/>
+              </w:rPr>
+              <w:t>RECURSOS</w:t>
+            </w:r>
+          </w:p>
+        </w:tc>
+        <w:tc>
+          <w:tcPr>
+            <w:tcW w:w="3150" w:type="dxa"/>
+            <w:gridSpan w:val="6"/>
+          </w:tcPr>
+          <w:p>
+            <w:pPr>
+              <w:jc w:val="center"/>
+              <w:rPr>
+                <w:rFonts w:ascii="Arial" w:hAnsi="Arial" w:cs="Arial"/>
+                <w:b/>
+                <w:bCs/>
+                <w:sz w:val="18"/>
+                <w:szCs w:val="18"/>
+              </w:rPr>
+            </w:pPr>
+            <w:r>
+              <w:rPr>
+                <w:rFonts w:ascii="Arial" w:hAnsi="Arial" w:cs="Arial"/>
+                <w:b/>
+                <w:bCs/>
+                <w:color w:val="000000"/>
+                <w:sz w:val="18"/>
+                <w:szCs w:val="18"/>
+              </w:rPr>
+              <w:t>EVALUACIÓN</w:t>
+            </w:r>
+          </w:p>
+        </w:tc>
+      </w:tr>
+      <w:tr>
+        <w:trPr>
+          <w:trHeight w:val="423"/>
+        </w:trPr>
+        <w:tc>
+          <w:tcPr>
+            <w:tcW w:w="2372" w:type="dxa"/>
+            <w:vAlign w:val="center"/>
+          </w:tcPr>
+          <w:p>
+            <w:pPr>
+              <w:jc w:val="center"/>
+              <w:rPr>
+                <w:rFonts w:ascii="Arial" w:hAnsi="Arial" w:cs="Arial"/>
+                <w:b/>
+                <w:bCs/>
+                <w:sz w:val="20"/>
+                <w:szCs w:val="20"/>
+              </w:rPr>
+            </w:pPr>
+            <w:r>
+              <w:rPr>
+                <w:rFonts w:ascii="Arial" w:hAnsi="Arial" w:cs="Arial"/>
+                <w:b/>
+                <w:bCs/>
+                <w:sz w:val="20"/>
+                <w:szCs w:val="20"/>
+              </w:rPr>
+              <w:t>PROCEDIMENTALES</w:t>
+            </w:r>
+          </w:p>
+        </w:tc>
+        <w:tc>
+          <w:tcPr>
+            <w:tcW w:w="1983" w:type="dxa"/>
+            <w:gridSpan w:val="8"/>
+            <w:vAlign w:val="center"/>
+          </w:tcPr>
+          <w:p>
+            <w:pPr>
+              <w:jc w:val="center"/>
+              <w:rPr>
+                <w:rFonts w:ascii="Arial" w:hAnsi="Arial" w:cs="Arial"/>
+                <w:b/>
+                <w:bCs/>
+                <w:sz w:val="20"/>
+                <w:szCs w:val="20"/>
+              </w:rPr>
+            </w:pPr>
+            <w:r>
+              <w:rPr>
+                <w:rFonts w:ascii="Arial" w:hAnsi="Arial" w:cs="Arial"/>
+                <w:b/>
+                <w:bCs/>
+                <w:sz w:val="20"/>
+                <w:szCs w:val="20"/>
+              </w:rPr>
+              <w:t>CONCEPTUALES</w:t>
+            </w:r>
+          </w:p>
+        </w:tc>
+        <w:tc>
+          <w:tcPr>
+            <w:tcW w:w="1842" w:type="dxa"/>
+            <w:gridSpan w:val="3"/>
+            <w:vAlign w:val="center"/>
+          </w:tcPr>
+          <w:p>
+            <w:pPr>
+              <w:jc w:val="center"/>
+              <w:rPr>
+                <w:rFonts w:ascii="Arial" w:hAnsi="Arial" w:cs="Arial"/>
+                <w:b/>
+                <w:bCs/>
+                <w:sz w:val="20"/>
+                <w:szCs w:val="20"/>
+              </w:rPr>
+            </w:pPr>
+            <w:r>
+              <w:rPr>
+                <w:rFonts w:ascii="Arial" w:hAnsi="Arial" w:cs="Arial"/>
+                <w:b/>
+                <w:bCs/>
+                <w:sz w:val="20"/>
+                <w:szCs w:val="20"/>
+              </w:rPr>
+              <w:t>ACTITUDINALES</w:t>
+            </w:r>
+          </w:p>
+        </w:tc>
+        <w:tc>
+          <w:tcPr>
+            <w:tcW w:w="3831" w:type="dxa"/>
+            <w:gridSpan w:val="9"/>
+            <w:vMerge/>
+          </w:tcPr>
+          <w:p>
+            <w:pPr>
+              <w:jc w:val="center"/>
+              <w:rPr>
+                <w:rFonts w:ascii="Arial" w:hAnsi="Arial" w:cs="Arial"/>
+                <w:b/>
+                <w:bCs/>
+                <w:sz w:val="18"/>
+                <w:szCs w:val="18"/>
+              </w:rPr>
+            </w:pPr>
+          </w:p>
+        </w:tc>
+        <w:tc>
+          <w:tcPr>
+            <w:tcW w:w="1843" w:type="dxa"/>
+            <w:gridSpan w:val="5"/>
+            <w:vMerge/>
+          </w:tcPr>
+          <w:p>
+            <w:pPr>
+              <w:jc w:val="center"/>
+              <w:rPr>
+                <w:rFonts w:ascii="Arial" w:hAnsi="Arial" w:cs="Arial"/>
+                <w:b/>
+                <w:bCs/>
+                <w:sz w:val="18"/>
+                <w:szCs w:val="18"/>
+              </w:rPr>
+            </w:pPr>
+          </w:p>
+        </w:tc>
+        <w:tc>
+          <w:tcPr>
+            <w:tcW w:w="1563" w:type="dxa"/>
+            <w:gridSpan w:val="4"/>
+          </w:tcPr>
+          <w:p>
+            <w:pPr>
+              <w:autoSpaceDE w:val="0"/>
+              <w:autoSpaceDN w:val="0"/>
+              <w:adjustRightInd w:val="0"/>
+              <w:jc w:val="center"/>
+              <w:rPr>
+                <w:rFonts w:ascii="Arial" w:hAnsi="Arial" w:cs="Arial"/>
+                <w:b/>
+                <w:bCs/>
+                <w:sz w:val="16"/>
+                <w:szCs w:val="16"/>
+              </w:rPr>
+            </w:pPr>
+            <w:r>
+              <w:rPr>
+                <w:rFonts w:ascii="Arial" w:hAnsi="Arial" w:cs="Arial"/>
+                <w:b/>
+                <w:bCs/>
+                <w:sz w:val="16"/>
+                <w:szCs w:val="16"/>
+              </w:rPr>
+              <w:t>Criterios de</w:t>
+            </w:r>
+          </w:p>
+          <w:p>
+            <w:pPr>
+              <w:autoSpaceDE w:val="0"/>
+              <w:autoSpaceDN w:val="0"/>
+              <w:adjustRightInd w:val="0"/>
+              <w:jc w:val="center"/>
+              <w:rPr>
+                <w:rFonts w:ascii="Arial" w:hAnsi="Arial" w:cs="Arial"/>
+                <w:b/>
+                <w:bCs/>
+                <w:sz w:val="16"/>
+                <w:szCs w:val="16"/>
+              </w:rPr>
+            </w:pPr>
+            <w:r>
+              <w:rPr>
+                <w:rFonts w:ascii="Arial" w:hAnsi="Arial" w:cs="Arial"/>
+                <w:b/>
+                <w:bCs/>
+                <w:sz w:val="16"/>
+                <w:szCs w:val="16"/>
+              </w:rPr>
+              <w:t>Evaluación de la</w:t>
+            </w:r>
+          </w:p>
+          <w:p>
+            <w:pPr>
+              <w:autoSpaceDE w:val="0"/>
+              <w:autoSpaceDN w:val="0"/>
+              <w:adjustRightInd w:val="0"/>
+              <w:jc w:val="center"/>
+              <w:rPr>
+                <w:rFonts w:ascii="Arial" w:hAnsi="Arial" w:cs="Arial"/>
+                <w:b/>
+                <w:bCs/>
+                <w:sz w:val="16"/>
+                <w:szCs w:val="16"/>
+              </w:rPr>
+            </w:pPr>
+            <w:r>
+              <w:rPr>
+                <w:rFonts w:ascii="Arial" w:hAnsi="Arial" w:cs="Arial"/>
+                <w:b/>
+                <w:bCs/>
+                <w:sz w:val="16"/>
+                <w:szCs w:val="16"/>
+              </w:rPr>
+              <w:t>Unidad</w:t>
+            </w:r>
+          </w:p>
+        </w:tc>
+        <w:tc>
+          <w:tcPr>
+            <w:tcW w:w="1587" w:type="dxa"/>
+            <w:gridSpan w:val="2"/>
+          </w:tcPr>
+          <w:p>
+            <w:pPr>
+              <w:autoSpaceDE w:val="0"/>
+              <w:autoSpaceDN w:val="0"/>
+              <w:adjustRightInd w:val="0"/>
+              <w:jc w:val="center"/>
+              <w:rPr>
+                <w:rFonts w:ascii="Arial" w:hAnsi="Arial" w:cs="Arial"/>
+                <w:b/>
+                <w:bCs/>
+                <w:sz w:val="16"/>
+                <w:szCs w:val="16"/>
+              </w:rPr>
+            </w:pPr>
+            <w:r>
+              <w:rPr>
+                <w:rFonts w:ascii="Arial" w:hAnsi="Arial" w:cs="Arial"/>
+                <w:b/>
+                <w:bCs/>
+                <w:sz w:val="16"/>
+                <w:szCs w:val="16"/>
+              </w:rPr>
+              <w:t>Técnicas e</w:t>
+            </w:r>
+          </w:p>
+          <w:p>
+            <w:pPr>
+              <w:autoSpaceDE w:val="0"/>
+              <w:autoSpaceDN w:val="0"/>
+              <w:adjustRightInd w:val="0"/>
+              <w:jc w:val="center"/>
+              <w:rPr>
+                <w:rFonts w:ascii="Arial" w:hAnsi="Arial" w:cs="Arial"/>
+                <w:b/>
+                <w:bCs/>
+                <w:sz w:val="16"/>
+                <w:szCs w:val="16"/>
+              </w:rPr>
+            </w:pPr>
+            <w:r>
+              <w:rPr>
+                <w:rFonts w:ascii="Arial" w:hAnsi="Arial" w:cs="Arial"/>
+                <w:b/>
+                <w:bCs/>
+                <w:sz w:val="16"/>
+                <w:szCs w:val="16"/>
+              </w:rPr>
+              <w:t>instrumentos de</w:t>
+            </w:r>
+          </w:p>
+          <w:p>
+            <w:pPr>
+              <w:autoSpaceDE w:val="0"/>
+              <w:autoSpaceDN w:val="0"/>
+              <w:adjustRightInd w:val="0"/>
+              <w:jc w:val="center"/>
+              <w:rPr>
+                <w:rFonts w:ascii="Arial" w:hAnsi="Arial" w:cs="Arial"/>
+                <w:b/>
+                <w:bCs/>
+                <w:sz w:val="16"/>
+                <w:szCs w:val="16"/>
+              </w:rPr>
+            </w:pPr>
+            <w:r>
+              <w:rPr>
+                <w:rFonts w:ascii="Arial" w:hAnsi="Arial" w:cs="Arial"/>
+                <w:b/>
+                <w:bCs/>
+                <w:sz w:val="16"/>
+                <w:szCs w:val="16"/>
+              </w:rPr>
+              <w:t>Evaluación</w:t>
+            </w:r>
+          </w:p>
+        </w:tc>
+      </w:tr>
+      <w:tr>
+        <w:trPr>
+          <w:trHeight w:val="423"/>
         </w:trPr>
         <w:tc>
           <w:tcPr>
@@ -181,10 +1936,13 @@
           </w:tcPr>
           <w:p>
             <w:pPr>
+              <w:autoSpaceDE w:val="0"/>
+              <w:autoSpaceDN w:val="0"/>
+              <w:adjustRightInd w:val="0"/>
               <w:jc w:val="center"/>
               <w:rPr>
                 <w:rFonts w:ascii="Arial" w:hAnsi="Arial" w:cs="Arial"/>
-                <w:color w:val="000000"/>
+                <w:b/>
                 <w:sz w:val="24"/>
                 <w:szCs w:val="24"/>
               </w:rPr>
@@ -192,65 +1950,25 @@
             <w:r>
               <w:rPr>
                 <w:rFonts w:ascii="Arial" w:hAnsi="Arial" w:cs="Arial"/>
-                <w:b/>
-                <w:bCs/>
-                <w:sz w:val="24"/>
-                <w:szCs w:val="24"/>
-              </w:rPr>
-              <w:t xml:space="preserve">Semana 13: 15 </w:t>
-            </w:r>
-            <w:r>
-              <w:rPr>
-                <w:rFonts w:ascii="Arial" w:hAnsi="Arial" w:cs="Arial"/>
-                <w:b/>
-                <w:bCs/>
-                <w:sz w:val="24"/>
-                <w:szCs w:val="24"/>
-                <w:lang w:val="es-MX"/>
-              </w:rPr>
-              <w:t xml:space="preserve">al 19 junio del 2026 </w:t>
-            </w:r>
-            <w:r>
-              <w:rPr>
-                <w:rFonts w:ascii="Arial" w:hAnsi="Arial" w:cs="Arial"/>
-                <w:b/>
-                <w:bCs/>
-                <w:sz w:val="24"/>
-                <w:szCs w:val="24"/>
-                <w:highlight w:val="yellow"/>
-                <w:lang w:val="es-MX"/>
-              </w:rPr>
-              <w:t>(desde el 15 inicia examen del III Trimestre para bachillerato y el 16 desde 1º a 10º EGB)</w:t>
+                <w:lang w:val="es-EC"/>
+              </w:rPr>
+              <w:t>{{#semanas}}{{semana_label}}</w:t>
             </w:r>
           </w:p>
         </w:tc>
       </w:tr>
       <w:tr>
         <w:trPr>
-          <w:trHeight w:val="545"/>
+          <w:trHeight w:val="594"/>
         </w:trPr>
         <w:tc>
           <w:tcPr>
-            <w:tcW w:w="2372" w:type="dxa"/>
-          </w:tcPr>
-          <w:p>
-            <w:pPr>
-              <w:pStyle w:val="Default"/>
-              <w:rPr>
-                <w:rFonts w:ascii="Arial" w:hAnsi="Arial" w:cs="Arial"/>
-                <w:sz w:val="18"/>
-                <w:szCs w:val="18"/>
-              </w:rPr>
-            </w:pPr>
-          </w:p>
-        </w:tc>
-        <w:tc>
-          <w:tcPr>
-            <w:tcW w:w="1983" w:type="dxa"/>
-            <w:gridSpan w:val="8"/>
-          </w:tcPr>
-          <w:p>
-            <w:pPr>
+            <w:tcW w:w="2387" w:type="dxa"/>
+            <w:gridSpan w:val="2"/>
+          </w:tcPr>
+          <w:p>
+            <w:pPr>
+              <w:jc w:val="center"/>
               <w:rPr>
                 <w:rFonts w:ascii="Arial" w:hAnsi="Arial" w:cs="Arial"/>
                 <w:color w:val="000000"/>
@@ -258,15 +1976,23 @@
                 <w:szCs w:val="23"/>
               </w:rPr>
             </w:pPr>
-          </w:p>
-        </w:tc>
-        <w:tc>
-          <w:tcPr>
-            <w:tcW w:w="1830" w:type="dxa"/>
-            <w:gridSpan w:val="2"/>
-          </w:tcPr>
-          <w:p>
-            <w:pPr>
+            <w:r>
+              <w:rPr>
+                <w:rFonts w:ascii="Arial" w:hAnsi="Arial" w:cs="Arial"/>
+                <w:lang w:val="es-EC"/>
+              </w:rPr>
+              <w:t>{{proc}}</w:t>
+            </w:r>
+          </w:p>
+        </w:tc>
+        <w:tc>
+          <w:tcPr>
+            <w:tcW w:w="1990" w:type="dxa"/>
+            <w:gridSpan w:val="8"/>
+          </w:tcPr>
+          <w:p>
+            <w:pPr>
+              <w:jc w:val="center"/>
               <w:rPr>
                 <w:rFonts w:ascii="Arial" w:hAnsi="Arial" w:cs="Arial"/>
                 <w:color w:val="000000"/>
@@ -274,15 +2000,23 @@
                 <w:szCs w:val="23"/>
               </w:rPr>
             </w:pPr>
-          </w:p>
-        </w:tc>
-        <w:tc>
-          <w:tcPr>
-            <w:tcW w:w="3843" w:type="dxa"/>
-            <w:gridSpan w:val="10"/>
-          </w:tcPr>
-          <w:p>
-            <w:pPr>
+            <w:r>
+              <w:rPr>
+                <w:rFonts w:ascii="Arial" w:hAnsi="Arial" w:cs="Arial"/>
+                <w:lang w:val="es-EC"/>
+              </w:rPr>
+              <w:t>{{conc}}</w:t>
+            </w:r>
+          </w:p>
+        </w:tc>
+        <w:tc>
+          <w:tcPr>
+            <w:tcW w:w="1854" w:type="dxa"/>
+            <w:gridSpan w:val="4"/>
+          </w:tcPr>
+          <w:p>
+            <w:pPr>
+              <w:jc w:val="center"/>
               <w:rPr>
                 <w:rFonts w:ascii="Arial" w:hAnsi="Arial" w:cs="Arial"/>
                 <w:color w:val="000000"/>
@@ -290,13 +2024,14 @@
                 <w:szCs w:val="23"/>
               </w:rPr>
             </w:pPr>
-          </w:p>
-        </w:tc>
-        <w:tc>
-          <w:tcPr>
-            <w:tcW w:w="1843" w:type="dxa"/>
-            <w:gridSpan w:val="5"/>
-          </w:tcPr>
+            <w:r>
+              <w:rPr>
+                <w:rFonts w:ascii="Arial" w:hAnsi="Arial" w:cs="Arial"/>
+                <w:lang w:val="es-EC"/>
+              </w:rPr>
+              <w:t>{{act}}</w:t>
+            </w:r>
+          </w:p>
           <w:p>
             <w:pPr>
               <w:rPr>
@@ -310,27 +2045,12 @@
         </w:tc>
         <w:tc>
           <w:tcPr>
-            <w:tcW w:w="1563" w:type="dxa"/>
-            <w:gridSpan w:val="4"/>
-          </w:tcPr>
-          <w:p>
-            <w:pPr>
-              <w:pStyle w:val="Default"/>
-              <w:rPr>
-                <w:rFonts w:ascii="Arial" w:hAnsi="Arial" w:cs="Arial"/>
-                <w:sz w:val="23"/>
-                <w:szCs w:val="23"/>
-              </w:rPr>
-            </w:pPr>
-          </w:p>
-        </w:tc>
-        <w:tc>
-          <w:tcPr>
-            <w:tcW w:w="1587" w:type="dxa"/>
-            <w:gridSpan w:val="2"/>
-          </w:tcPr>
-          <w:p>
-            <w:pPr>
+            <w:tcW w:w="3815" w:type="dxa"/>
+            <w:gridSpan w:val="9"/>
+          </w:tcPr>
+          <w:p>
+            <w:pPr>
+              <w:jc w:val="center"/>
               <w:rPr>
                 <w:rFonts w:ascii="Arial" w:hAnsi="Arial" w:cs="Arial"/>
                 <w:color w:val="000000"/>
@@ -338,80 +2058,23 @@
                 <w:szCs w:val="23"/>
               </w:rPr>
             </w:pPr>
-          </w:p>
-        </w:tc>
-      </w:tr>
-      <w:tr>
-        <w:trPr>
-          <w:trHeight w:val="545"/>
-        </w:trPr>
-        <w:tc>
-          <w:tcPr>
-            <w:tcW w:w="15021" w:type="dxa"/>
-            <w:gridSpan w:val="32"/>
-            <w:shd w:val="clear" w:color="auto" w:fill="F2F2F2" w:themeFill="background1" w:themeFillShade="F2"/>
-            <w:vAlign w:val="center"/>
+            <w:r>
+              <w:rPr>
+                <w:rFonts w:ascii="Arial" w:hAnsi="Arial" w:cs="Arial"/>
+                <w:lang w:val="es-EC"/>
+              </w:rPr>
+              <w:t>{{actividades}}</w:t>
+            </w:r>
+          </w:p>
+        </w:tc>
+        <w:tc>
+          <w:tcPr>
+            <w:tcW w:w="1854" w:type="dxa"/>
+            <w:gridSpan w:val="5"/>
           </w:tcPr>
           <w:p>
             <w:pPr>
               <w:jc w:val="center"/>
-              <w:rPr>
-                <w:rFonts w:ascii="Arial" w:hAnsi="Arial" w:cs="Arial"/>
-                <w:color w:val="000000"/>
-                <w:sz w:val="24"/>
-                <w:szCs w:val="24"/>
-              </w:rPr>
-            </w:pPr>
-            <w:r>
-              <w:rPr>
-                <w:rFonts w:ascii="Arial" w:hAnsi="Arial" w:cs="Arial"/>
-                <w:b/>
-                <w:bCs/>
-                <w:sz w:val="24"/>
-                <w:szCs w:val="24"/>
-              </w:rPr>
-              <w:t>Semana 14: 22</w:t>
-            </w:r>
-            <w:r>
-              <w:rPr>
-                <w:rFonts w:ascii="Arial" w:hAnsi="Arial" w:cs="Arial"/>
-                <w:b/>
-                <w:bCs/>
-                <w:sz w:val="24"/>
-                <w:szCs w:val="24"/>
-                <w:lang w:val="es-MX"/>
-              </w:rPr>
-              <w:t xml:space="preserve"> al 26 junio del 2026</w:t>
-            </w:r>
-          </w:p>
-        </w:tc>
-      </w:tr>
-      <w:tr>
-        <w:trPr>
-          <w:trHeight w:val="545"/>
-        </w:trPr>
-        <w:tc>
-          <w:tcPr>
-            <w:tcW w:w="2372" w:type="dxa"/>
-          </w:tcPr>
-          <w:p>
-            <w:pPr>
-              <w:pStyle w:val="Default"/>
-              <w:rPr>
-                <w:rFonts w:ascii="Arial" w:hAnsi="Arial" w:cs="Arial"/>
-                <w:sz w:val="18"/>
-                <w:szCs w:val="18"/>
-              </w:rPr>
-            </w:pPr>
-          </w:p>
-        </w:tc>
-        <w:tc>
-          <w:tcPr>
-            <w:tcW w:w="1983" w:type="dxa"/>
-            <w:gridSpan w:val="8"/>
-          </w:tcPr>
-          <w:p>
-            <w:pPr>
               <w:rPr>
                 <w:rFonts w:ascii="Arial" w:hAnsi="Arial" w:cs="Arial"/>
                 <w:color w:val="000000"/>
@@ -419,15 +2082,23 @@
                 <w:szCs w:val="23"/>
               </w:rPr>
             </w:pPr>
-          </w:p>
-        </w:tc>
-        <w:tc>
-          <w:tcPr>
-            <w:tcW w:w="1830" w:type="dxa"/>
-            <w:gridSpan w:val="2"/>
-          </w:tcPr>
-          <w:p>
-            <w:pPr>
+            <w:r>
+              <w:rPr>
+                <w:rFonts w:ascii="Arial" w:hAnsi="Arial" w:cs="Arial"/>
+                <w:lang w:val="es-EC"/>
+              </w:rPr>
+              <w:t>{{recursos}}</w:t>
+            </w:r>
+          </w:p>
+        </w:tc>
+        <w:tc>
+          <w:tcPr>
+            <w:tcW w:w="1563" w:type="dxa"/>
+            <w:gridSpan w:val="3"/>
+          </w:tcPr>
+          <w:p>
+            <w:pPr>
+              <w:jc w:val="center"/>
               <w:rPr>
                 <w:rFonts w:ascii="Arial" w:hAnsi="Arial" w:cs="Arial"/>
                 <w:color w:val="000000"/>
@@ -435,15 +2106,22 @@
                 <w:szCs w:val="23"/>
               </w:rPr>
             </w:pPr>
-          </w:p>
-        </w:tc>
-        <w:tc>
-          <w:tcPr>
-            <w:tcW w:w="3843" w:type="dxa"/>
-            <w:gridSpan w:val="10"/>
-          </w:tcPr>
-          <w:p>
-            <w:pPr>
+            <w:r>
+              <w:rPr>
+                <w:rFonts w:ascii="Arial" w:hAnsi="Arial" w:cs="Arial"/>
+                <w:lang w:val="es-EC"/>
+              </w:rPr>
+              <w:t>{{criterios}}</w:t>
+            </w:r>
+          </w:p>
+        </w:tc>
+        <w:tc>
+          <w:tcPr>
+            <w:tcW w:w="1558" w:type="dxa"/>
+          </w:tcPr>
+          <w:p>
+            <w:pPr>
+              <w:jc w:val="center"/>
               <w:rPr>
                 <w:rFonts w:ascii="Arial" w:hAnsi="Arial" w:cs="Arial"/>
                 <w:color w:val="000000"/>
@@ -451,54 +2129,13 @@
                 <w:szCs w:val="23"/>
               </w:rPr>
             </w:pPr>
-          </w:p>
-        </w:tc>
-        <w:tc>
-          <w:tcPr>
-            <w:tcW w:w="1843" w:type="dxa"/>
-            <w:gridSpan w:val="5"/>
-          </w:tcPr>
-          <w:p>
-            <w:pPr>
-              <w:rPr>
-                <w:rFonts w:ascii="Arial" w:hAnsi="Arial" w:cs="Arial"/>
-                <w:color w:val="000000"/>
-                <w:sz w:val="23"/>
-                <w:szCs w:val="23"/>
-              </w:rPr>
-            </w:pPr>
-          </w:p>
-        </w:tc>
-        <w:tc>
-          <w:tcPr>
-            <w:tcW w:w="1563" w:type="dxa"/>
-            <w:gridSpan w:val="4"/>
-          </w:tcPr>
-          <w:p>
-            <w:pPr>
-              <w:pStyle w:val="Default"/>
-              <w:rPr>
-                <w:rFonts w:ascii="Arial" w:hAnsi="Arial" w:cs="Arial"/>
-                <w:sz w:val="23"/>
-                <w:szCs w:val="23"/>
-              </w:rPr>
-            </w:pPr>
-          </w:p>
-        </w:tc>
-        <w:tc>
-          <w:tcPr>
-            <w:tcW w:w="1587" w:type="dxa"/>
-            <w:gridSpan w:val="2"/>
-          </w:tcPr>
-          <w:p>
-            <w:pPr>
-              <w:rPr>
-                <w:rFonts w:ascii="Arial" w:hAnsi="Arial" w:cs="Arial"/>
-                <w:color w:val="000000"/>
-                <w:sz w:val="23"/>
-                <w:szCs w:val="23"/>
-              </w:rPr>
-            </w:pPr>
+            <w:r>
+              <w:rPr>
+                <w:rFonts w:ascii="Arial" w:hAnsi="Arial" w:cs="Arial"/>
+                <w:lang w:val="es-EC"/>
+              </w:rPr>
+              <w:t>{{tecnicas}}{{/semanas}}</w:t>
+            </w:r>
           </w:p>
         </w:tc>
       </w:tr>
@@ -622,6 +2259,13 @@
                 <w:rFonts w:ascii="Arial" w:hAnsi="Arial" w:cs="Arial"/>
               </w:rPr>
             </w:pPr>
+            <w:r>
+              <w:rPr>
+                <w:rFonts w:ascii="Arial" w:hAnsi="Arial" w:cs="Arial"/>
+                <w:lang w:val="es-EC"/>
+              </w:rPr>
+              <w:t>{{#adaptaciones}}{{iniciales}}</w:t>
+            </w:r>
           </w:p>
         </w:tc>
         <w:tc>
@@ -639,6 +2283,13 @@
                 <w:rFonts w:ascii="Arial" w:hAnsi="Arial" w:cs="Arial"/>
               </w:rPr>
             </w:pPr>
+            <w:r>
+              <w:rPr>
+                <w:rFonts w:ascii="Arial" w:hAnsi="Arial" w:cs="Arial"/>
+                <w:lang w:val="es-EC"/>
+              </w:rPr>
+              <w:t>{{necesidad}}{{/adaptaciones}}</w:t>
+            </w:r>
           </w:p>
         </w:tc>
       </w:tr>
@@ -733,10 +2384,9 @@
             <w:r>
               <w:rPr>
                 <w:rFonts w:ascii="Arial" w:hAnsi="Arial" w:cs="Arial"/>
-                <w:b/>
-                <w:color w:val="000000"/>
-              </w:rPr>
-              <w:t>SEMANA 1:</w:t>
+                <w:lang w:val="es-EC"/>
+              </w:rPr>
+              <w:t>{{#estrategias}}{{semana_label}}</w:t>
             </w:r>
           </w:p>
         </w:tc>
@@ -762,6 +2412,13 @@
                 <w:color w:val="000000"/>
               </w:rPr>
             </w:pPr>
+            <w:r>
+              <w:rPr>
+                <w:rFonts w:ascii="Arial" w:hAnsi="Arial" w:cs="Arial"/>
+                <w:lang w:val="es-EC"/>
+              </w:rPr>
+              <w:t>{{competencia}}</w:t>
+            </w:r>
           </w:p>
         </w:tc>
         <w:tc>
@@ -781,853 +2438,13 @@
                 <w:color w:val="000000"/>
               </w:rPr>
             </w:pPr>
-          </w:p>
-        </w:tc>
-      </w:tr>
-      <w:tr>
-        <w:trPr>
-          <w:trHeight w:val="460"/>
-        </w:trPr>
-        <w:tc>
-          <w:tcPr>
-            <w:tcW w:w="15021" w:type="dxa"/>
-            <w:gridSpan w:val="32"/>
-            <w:shd w:val="clear" w:color="auto" w:fill="F2F2F2" w:themeFill="background1" w:themeFillShade="F2"/>
-            <w:vAlign w:val="center"/>
-          </w:tcPr>
-          <w:p>
-            <w:pPr>
-              <w:autoSpaceDE w:val="0"/>
-              <w:autoSpaceDN w:val="0"/>
-              <w:adjustRightInd w:val="0"/>
-              <w:jc w:val="center"/>
-              <w:rPr>
-                <w:rFonts w:ascii="Arial" w:hAnsi="Arial" w:cs="Arial"/>
-                <w:b/>
-                <w:color w:val="000000"/>
-              </w:rPr>
-            </w:pPr>
-            <w:r>
-              <w:rPr>
-                <w:rFonts w:ascii="Arial" w:hAnsi="Arial" w:cs="Arial"/>
-                <w:b/>
-                <w:color w:val="000000"/>
-              </w:rPr>
-              <w:t>SEMANA 2:</w:t>
-            </w:r>
-          </w:p>
-        </w:tc>
-      </w:tr>
-      <w:tr>
-        <w:trPr>
-          <w:trHeight w:val="460"/>
-        </w:trPr>
-        <w:tc>
-          <w:tcPr>
-            <w:tcW w:w="7089" w:type="dxa"/>
-            <w:gridSpan w:val="17"/>
-          </w:tcPr>
-          <w:p>
-            <w:pPr>
-              <w:autoSpaceDE w:val="0"/>
-              <w:autoSpaceDN w:val="0"/>
-              <w:adjustRightInd w:val="0"/>
-              <w:jc w:val="center"/>
-              <w:rPr>
-                <w:rFonts w:ascii="Arial" w:hAnsi="Arial" w:cs="Arial"/>
-                <w:b/>
-                <w:color w:val="000000"/>
-              </w:rPr>
-            </w:pPr>
-          </w:p>
-        </w:tc>
-        <w:tc>
-          <w:tcPr>
-            <w:tcW w:w="7932" w:type="dxa"/>
-            <w:gridSpan w:val="15"/>
-          </w:tcPr>
-          <w:p>
-            <w:pPr>
-              <w:autoSpaceDE w:val="0"/>
-              <w:autoSpaceDN w:val="0"/>
-              <w:adjustRightInd w:val="0"/>
-              <w:jc w:val="center"/>
-              <w:rPr>
-                <w:rFonts w:ascii="Arial" w:hAnsi="Arial" w:cs="Arial"/>
-                <w:b/>
-                <w:color w:val="000000"/>
-              </w:rPr>
-            </w:pPr>
-          </w:p>
-        </w:tc>
-      </w:tr>
-      <w:tr>
-        <w:trPr>
-          <w:trHeight w:val="460"/>
-        </w:trPr>
-        <w:tc>
-          <w:tcPr>
-            <w:tcW w:w="15021" w:type="dxa"/>
-            <w:gridSpan w:val="32"/>
-            <w:shd w:val="clear" w:color="auto" w:fill="F2F2F2" w:themeFill="background1" w:themeFillShade="F2"/>
-            <w:vAlign w:val="center"/>
-          </w:tcPr>
-          <w:p>
-            <w:pPr>
-              <w:autoSpaceDE w:val="0"/>
-              <w:autoSpaceDN w:val="0"/>
-              <w:adjustRightInd w:val="0"/>
-              <w:jc w:val="center"/>
-              <w:rPr>
-                <w:rFonts w:ascii="Arial" w:hAnsi="Arial" w:cs="Arial"/>
-                <w:b/>
-                <w:color w:val="000000"/>
-              </w:rPr>
-            </w:pPr>
-            <w:r>
-              <w:rPr>
-                <w:rFonts w:ascii="Arial" w:hAnsi="Arial" w:cs="Arial"/>
-                <w:b/>
-                <w:color w:val="000000"/>
-              </w:rPr>
-              <w:t>SEMANA 3:</w:t>
-            </w:r>
-          </w:p>
-        </w:tc>
-      </w:tr>
-      <w:tr>
-        <w:trPr>
-          <w:trHeight w:val="460"/>
-        </w:trPr>
-        <w:tc>
-          <w:tcPr>
-            <w:tcW w:w="7089" w:type="dxa"/>
-            <w:gridSpan w:val="17"/>
-          </w:tcPr>
-          <w:p>
-            <w:pPr>
-              <w:autoSpaceDE w:val="0"/>
-              <w:autoSpaceDN w:val="0"/>
-              <w:adjustRightInd w:val="0"/>
-              <w:jc w:val="center"/>
-              <w:rPr>
-                <w:rFonts w:ascii="Arial" w:hAnsi="Arial" w:cs="Arial"/>
-                <w:b/>
-                <w:color w:val="000000"/>
-              </w:rPr>
-            </w:pPr>
-          </w:p>
-        </w:tc>
-        <w:tc>
-          <w:tcPr>
-            <w:tcW w:w="7932" w:type="dxa"/>
-            <w:gridSpan w:val="15"/>
-          </w:tcPr>
-          <w:p>
-            <w:pPr>
-              <w:autoSpaceDE w:val="0"/>
-              <w:autoSpaceDN w:val="0"/>
-              <w:adjustRightInd w:val="0"/>
-              <w:jc w:val="center"/>
-              <w:rPr>
-                <w:rFonts w:ascii="Arial" w:hAnsi="Arial" w:cs="Arial"/>
-                <w:b/>
-                <w:color w:val="000000"/>
-              </w:rPr>
-            </w:pPr>
-          </w:p>
-        </w:tc>
-      </w:tr>
-      <w:tr>
-        <w:trPr>
-          <w:trHeight w:val="460"/>
-        </w:trPr>
-        <w:tc>
-          <w:tcPr>
-            <w:tcW w:w="15021" w:type="dxa"/>
-            <w:gridSpan w:val="32"/>
-            <w:shd w:val="clear" w:color="auto" w:fill="F2F2F2" w:themeFill="background1" w:themeFillShade="F2"/>
-            <w:vAlign w:val="center"/>
-          </w:tcPr>
-          <w:p>
-            <w:pPr>
-              <w:autoSpaceDE w:val="0"/>
-              <w:autoSpaceDN w:val="0"/>
-              <w:adjustRightInd w:val="0"/>
-              <w:jc w:val="center"/>
-              <w:rPr>
-                <w:rFonts w:ascii="Arial" w:hAnsi="Arial" w:cs="Arial"/>
-                <w:b/>
-                <w:color w:val="000000"/>
-              </w:rPr>
-            </w:pPr>
-            <w:r>
-              <w:rPr>
-                <w:rFonts w:ascii="Arial" w:hAnsi="Arial" w:cs="Arial"/>
-                <w:b/>
-                <w:color w:val="000000"/>
-              </w:rPr>
-              <w:t>SEMANA 4:</w:t>
-            </w:r>
-          </w:p>
-        </w:tc>
-      </w:tr>
-      <w:tr>
-        <w:trPr>
-          <w:trHeight w:val="460"/>
-        </w:trPr>
-        <w:tc>
-          <w:tcPr>
-            <w:tcW w:w="7089" w:type="dxa"/>
-            <w:gridSpan w:val="17"/>
-          </w:tcPr>
-          <w:p>
-            <w:pPr>
-              <w:autoSpaceDE w:val="0"/>
-              <w:autoSpaceDN w:val="0"/>
-              <w:adjustRightInd w:val="0"/>
-              <w:jc w:val="center"/>
-              <w:rPr>
-                <w:rFonts w:ascii="Arial" w:hAnsi="Arial" w:cs="Arial"/>
-                <w:b/>
-                <w:color w:val="000000"/>
-              </w:rPr>
-            </w:pPr>
-          </w:p>
-        </w:tc>
-        <w:tc>
-          <w:tcPr>
-            <w:tcW w:w="7932" w:type="dxa"/>
-            <w:gridSpan w:val="15"/>
-          </w:tcPr>
-          <w:p>
-            <w:pPr>
-              <w:autoSpaceDE w:val="0"/>
-              <w:autoSpaceDN w:val="0"/>
-              <w:adjustRightInd w:val="0"/>
-              <w:jc w:val="center"/>
-              <w:rPr>
-                <w:rFonts w:ascii="Arial" w:hAnsi="Arial" w:cs="Arial"/>
-                <w:b/>
-                <w:color w:val="000000"/>
-              </w:rPr>
-            </w:pPr>
-          </w:p>
-        </w:tc>
-      </w:tr>
-      <w:tr>
-        <w:trPr>
-          <w:trHeight w:val="460"/>
-        </w:trPr>
-        <w:tc>
-          <w:tcPr>
-            <w:tcW w:w="15021" w:type="dxa"/>
-            <w:gridSpan w:val="32"/>
-            <w:shd w:val="clear" w:color="auto" w:fill="F2F2F2" w:themeFill="background1" w:themeFillShade="F2"/>
-            <w:vAlign w:val="center"/>
-          </w:tcPr>
-          <w:p>
-            <w:pPr>
-              <w:autoSpaceDE w:val="0"/>
-              <w:autoSpaceDN w:val="0"/>
-              <w:adjustRightInd w:val="0"/>
-              <w:jc w:val="center"/>
-              <w:rPr>
-                <w:rFonts w:ascii="Arial" w:hAnsi="Arial" w:cs="Arial"/>
-                <w:b/>
-                <w:color w:val="000000"/>
-              </w:rPr>
-            </w:pPr>
-            <w:r>
-              <w:rPr>
-                <w:rFonts w:ascii="Arial" w:hAnsi="Arial" w:cs="Arial"/>
-                <w:b/>
-                <w:color w:val="000000"/>
-              </w:rPr>
-              <w:t>SEMANA 5:</w:t>
-            </w:r>
-          </w:p>
-        </w:tc>
-      </w:tr>
-      <w:tr>
-        <w:trPr>
-          <w:trHeight w:val="460"/>
-        </w:trPr>
-        <w:tc>
-          <w:tcPr>
-            <w:tcW w:w="7089" w:type="dxa"/>
-            <w:gridSpan w:val="17"/>
-          </w:tcPr>
-          <w:p>
-            <w:pPr>
-              <w:autoSpaceDE w:val="0"/>
-              <w:autoSpaceDN w:val="0"/>
-              <w:adjustRightInd w:val="0"/>
-              <w:jc w:val="center"/>
-              <w:rPr>
-                <w:rFonts w:ascii="Arial" w:hAnsi="Arial" w:cs="Arial"/>
-                <w:b/>
-                <w:color w:val="000000"/>
-              </w:rPr>
-            </w:pPr>
-          </w:p>
-        </w:tc>
-        <w:tc>
-          <w:tcPr>
-            <w:tcW w:w="7932" w:type="dxa"/>
-            <w:gridSpan w:val="15"/>
-          </w:tcPr>
-          <w:p>
-            <w:pPr>
-              <w:autoSpaceDE w:val="0"/>
-              <w:autoSpaceDN w:val="0"/>
-              <w:adjustRightInd w:val="0"/>
-              <w:jc w:val="center"/>
-              <w:rPr>
-                <w:rFonts w:ascii="Arial" w:hAnsi="Arial" w:cs="Arial"/>
-                <w:b/>
-                <w:color w:val="000000"/>
-              </w:rPr>
-            </w:pPr>
-          </w:p>
-        </w:tc>
-      </w:tr>
-      <w:tr>
-        <w:trPr>
-          <w:trHeight w:val="460"/>
-        </w:trPr>
-        <w:tc>
-          <w:tcPr>
-            <w:tcW w:w="15021" w:type="dxa"/>
-            <w:gridSpan w:val="32"/>
-            <w:shd w:val="clear" w:color="auto" w:fill="F2F2F2" w:themeFill="background1" w:themeFillShade="F2"/>
-            <w:vAlign w:val="center"/>
-          </w:tcPr>
-          <w:p>
-            <w:pPr>
-              <w:autoSpaceDE w:val="0"/>
-              <w:autoSpaceDN w:val="0"/>
-              <w:adjustRightInd w:val="0"/>
-              <w:jc w:val="center"/>
-              <w:rPr>
-                <w:rFonts w:ascii="Arial" w:hAnsi="Arial" w:cs="Arial"/>
-                <w:b/>
-                <w:color w:val="000000"/>
-              </w:rPr>
-            </w:pPr>
-            <w:r>
-              <w:rPr>
-                <w:rFonts w:ascii="Arial" w:hAnsi="Arial" w:cs="Arial"/>
-                <w:b/>
-                <w:color w:val="000000"/>
-              </w:rPr>
-              <w:t>SEMANA 6:</w:t>
-            </w:r>
-          </w:p>
-        </w:tc>
-      </w:tr>
-      <w:tr>
-        <w:trPr>
-          <w:trHeight w:val="460"/>
-        </w:trPr>
-        <w:tc>
-          <w:tcPr>
-            <w:tcW w:w="7089" w:type="dxa"/>
-            <w:gridSpan w:val="17"/>
-          </w:tcPr>
-          <w:p>
-            <w:pPr>
-              <w:autoSpaceDE w:val="0"/>
-              <w:autoSpaceDN w:val="0"/>
-              <w:adjustRightInd w:val="0"/>
-              <w:jc w:val="center"/>
-              <w:rPr>
-                <w:rFonts w:ascii="Arial" w:hAnsi="Arial" w:cs="Arial"/>
-                <w:b/>
-                <w:color w:val="000000"/>
-              </w:rPr>
-            </w:pPr>
-          </w:p>
-        </w:tc>
-        <w:tc>
-          <w:tcPr>
-            <w:tcW w:w="7932" w:type="dxa"/>
-            <w:gridSpan w:val="15"/>
-          </w:tcPr>
-          <w:p>
-            <w:pPr>
-              <w:autoSpaceDE w:val="0"/>
-              <w:autoSpaceDN w:val="0"/>
-              <w:adjustRightInd w:val="0"/>
-              <w:jc w:val="center"/>
-              <w:rPr>
-                <w:rFonts w:ascii="Arial" w:hAnsi="Arial" w:cs="Arial"/>
-                <w:b/>
-                <w:color w:val="000000"/>
-              </w:rPr>
-            </w:pPr>
-          </w:p>
-        </w:tc>
-      </w:tr>
-      <w:tr>
-        <w:trPr>
-          <w:trHeight w:val="460"/>
-        </w:trPr>
-        <w:tc>
-          <w:tcPr>
-            <w:tcW w:w="15021" w:type="dxa"/>
-            <w:gridSpan w:val="32"/>
-            <w:shd w:val="clear" w:color="auto" w:fill="F2F2F2" w:themeFill="background1" w:themeFillShade="F2"/>
-            <w:vAlign w:val="center"/>
-          </w:tcPr>
-          <w:p>
-            <w:pPr>
-              <w:autoSpaceDE w:val="0"/>
-              <w:autoSpaceDN w:val="0"/>
-              <w:adjustRightInd w:val="0"/>
-              <w:jc w:val="center"/>
-              <w:rPr>
-                <w:rFonts w:ascii="Arial" w:hAnsi="Arial" w:cs="Arial"/>
-                <w:b/>
-                <w:color w:val="000000"/>
-              </w:rPr>
-            </w:pPr>
-            <w:r>
-              <w:rPr>
-                <w:rFonts w:ascii="Arial" w:hAnsi="Arial" w:cs="Arial"/>
-                <w:b/>
-                <w:color w:val="000000"/>
-              </w:rPr>
-              <w:t>SEMANA 7:</w:t>
-            </w:r>
-          </w:p>
-        </w:tc>
-      </w:tr>
-      <w:tr>
-        <w:trPr>
-          <w:trHeight w:val="460"/>
-        </w:trPr>
-        <w:tc>
-          <w:tcPr>
-            <w:tcW w:w="7089" w:type="dxa"/>
-            <w:gridSpan w:val="17"/>
-          </w:tcPr>
-          <w:p>
-            <w:pPr>
-              <w:autoSpaceDE w:val="0"/>
-              <w:autoSpaceDN w:val="0"/>
-              <w:adjustRightInd w:val="0"/>
-              <w:jc w:val="center"/>
-              <w:rPr>
-                <w:rFonts w:ascii="Arial" w:hAnsi="Arial" w:cs="Arial"/>
-                <w:b/>
-                <w:color w:val="000000"/>
-              </w:rPr>
-            </w:pPr>
-          </w:p>
-        </w:tc>
-        <w:tc>
-          <w:tcPr>
-            <w:tcW w:w="7932" w:type="dxa"/>
-            <w:gridSpan w:val="15"/>
-          </w:tcPr>
-          <w:p>
-            <w:pPr>
-              <w:autoSpaceDE w:val="0"/>
-              <w:autoSpaceDN w:val="0"/>
-              <w:adjustRightInd w:val="0"/>
-              <w:jc w:val="center"/>
-              <w:rPr>
-                <w:rFonts w:ascii="Arial" w:hAnsi="Arial" w:cs="Arial"/>
-                <w:b/>
-                <w:color w:val="000000"/>
-              </w:rPr>
-            </w:pPr>
-          </w:p>
-        </w:tc>
-      </w:tr>
-      <w:tr>
-        <w:trPr>
-          <w:trHeight w:val="460"/>
-        </w:trPr>
-        <w:tc>
-          <w:tcPr>
-            <w:tcW w:w="15021" w:type="dxa"/>
-            <w:gridSpan w:val="32"/>
-            <w:shd w:val="clear" w:color="auto" w:fill="F2F2F2" w:themeFill="background1" w:themeFillShade="F2"/>
-            <w:vAlign w:val="center"/>
-          </w:tcPr>
-          <w:p>
-            <w:pPr>
-              <w:autoSpaceDE w:val="0"/>
-              <w:autoSpaceDN w:val="0"/>
-              <w:adjustRightInd w:val="0"/>
-              <w:jc w:val="center"/>
-              <w:rPr>
-                <w:rFonts w:ascii="Arial" w:hAnsi="Arial" w:cs="Arial"/>
-                <w:b/>
-                <w:color w:val="000000"/>
-              </w:rPr>
-            </w:pPr>
-            <w:r>
-              <w:rPr>
-                <w:rFonts w:ascii="Arial" w:hAnsi="Arial" w:cs="Arial"/>
-                <w:b/>
-                <w:color w:val="000000"/>
-              </w:rPr>
-              <w:t>SEMANA 8:</w:t>
-            </w:r>
-          </w:p>
-        </w:tc>
-      </w:tr>
-      <w:tr>
-        <w:trPr>
-          <w:trHeight w:val="460"/>
-        </w:trPr>
-        <w:tc>
-          <w:tcPr>
-            <w:tcW w:w="7089" w:type="dxa"/>
-            <w:gridSpan w:val="17"/>
-          </w:tcPr>
-          <w:p>
-            <w:pPr>
-              <w:autoSpaceDE w:val="0"/>
-              <w:autoSpaceDN w:val="0"/>
-              <w:adjustRightInd w:val="0"/>
-              <w:jc w:val="center"/>
-              <w:rPr>
-                <w:rFonts w:ascii="Arial" w:hAnsi="Arial" w:cs="Arial"/>
-                <w:b/>
-                <w:color w:val="000000"/>
-              </w:rPr>
-            </w:pPr>
-          </w:p>
-        </w:tc>
-        <w:tc>
-          <w:tcPr>
-            <w:tcW w:w="7932" w:type="dxa"/>
-            <w:gridSpan w:val="15"/>
-          </w:tcPr>
-          <w:p>
-            <w:pPr>
-              <w:autoSpaceDE w:val="0"/>
-              <w:autoSpaceDN w:val="0"/>
-              <w:adjustRightInd w:val="0"/>
-              <w:jc w:val="center"/>
-              <w:rPr>
-                <w:rFonts w:ascii="Arial" w:hAnsi="Arial" w:cs="Arial"/>
-                <w:b/>
-                <w:color w:val="000000"/>
-              </w:rPr>
-            </w:pPr>
-          </w:p>
-        </w:tc>
-      </w:tr>
-      <w:tr>
-        <w:trPr>
-          <w:trHeight w:val="460"/>
-        </w:trPr>
-        <w:tc>
-          <w:tcPr>
-            <w:tcW w:w="15021" w:type="dxa"/>
-            <w:gridSpan w:val="32"/>
-            <w:shd w:val="clear" w:color="auto" w:fill="F2F2F2" w:themeFill="background1" w:themeFillShade="F2"/>
-            <w:vAlign w:val="center"/>
-          </w:tcPr>
-          <w:p>
-            <w:pPr>
-              <w:autoSpaceDE w:val="0"/>
-              <w:autoSpaceDN w:val="0"/>
-              <w:adjustRightInd w:val="0"/>
-              <w:jc w:val="center"/>
-              <w:rPr>
-                <w:rFonts w:ascii="Arial" w:hAnsi="Arial" w:cs="Arial"/>
-                <w:b/>
-                <w:color w:val="000000"/>
-              </w:rPr>
-            </w:pPr>
-            <w:r>
-              <w:rPr>
-                <w:rFonts w:ascii="Arial" w:hAnsi="Arial" w:cs="Arial"/>
-                <w:b/>
-                <w:color w:val="000000"/>
-              </w:rPr>
-              <w:t>SEMANA 9:</w:t>
-            </w:r>
-          </w:p>
-        </w:tc>
-      </w:tr>
-      <w:tr>
-        <w:trPr>
-          <w:trHeight w:val="460"/>
-        </w:trPr>
-        <w:tc>
-          <w:tcPr>
-            <w:tcW w:w="7089" w:type="dxa"/>
-            <w:gridSpan w:val="17"/>
-          </w:tcPr>
-          <w:p>
-            <w:pPr>
-              <w:autoSpaceDE w:val="0"/>
-              <w:autoSpaceDN w:val="0"/>
-              <w:adjustRightInd w:val="0"/>
-              <w:jc w:val="center"/>
-              <w:rPr>
-                <w:rFonts w:ascii="Arial" w:hAnsi="Arial" w:cs="Arial"/>
-                <w:b/>
-                <w:color w:val="000000"/>
-              </w:rPr>
-            </w:pPr>
-          </w:p>
-        </w:tc>
-        <w:tc>
-          <w:tcPr>
-            <w:tcW w:w="7932" w:type="dxa"/>
-            <w:gridSpan w:val="15"/>
-          </w:tcPr>
-          <w:p>
-            <w:pPr>
-              <w:autoSpaceDE w:val="0"/>
-              <w:autoSpaceDN w:val="0"/>
-              <w:adjustRightInd w:val="0"/>
-              <w:jc w:val="center"/>
-              <w:rPr>
-                <w:rFonts w:ascii="Arial" w:hAnsi="Arial" w:cs="Arial"/>
-                <w:b/>
-                <w:color w:val="000000"/>
-              </w:rPr>
-            </w:pPr>
-          </w:p>
-        </w:tc>
-      </w:tr>
-      <w:tr>
-        <w:trPr>
-          <w:trHeight w:val="460"/>
-        </w:trPr>
-        <w:tc>
-          <w:tcPr>
-            <w:tcW w:w="15021" w:type="dxa"/>
-            <w:gridSpan w:val="32"/>
-            <w:shd w:val="clear" w:color="auto" w:fill="F2F2F2" w:themeFill="background1" w:themeFillShade="F2"/>
-            <w:vAlign w:val="center"/>
-          </w:tcPr>
-          <w:p>
-            <w:pPr>
-              <w:autoSpaceDE w:val="0"/>
-              <w:autoSpaceDN w:val="0"/>
-              <w:adjustRightInd w:val="0"/>
-              <w:jc w:val="center"/>
-              <w:rPr>
-                <w:rFonts w:ascii="Arial" w:hAnsi="Arial" w:cs="Arial"/>
-                <w:b/>
-                <w:color w:val="000000"/>
-              </w:rPr>
-            </w:pPr>
-            <w:r>
-              <w:rPr>
-                <w:rFonts w:ascii="Arial" w:hAnsi="Arial" w:cs="Arial"/>
-                <w:b/>
-                <w:color w:val="000000"/>
-              </w:rPr>
-              <w:t>SEMANA 10:</w:t>
-            </w:r>
-          </w:p>
-        </w:tc>
-      </w:tr>
-      <w:tr>
-        <w:trPr>
-          <w:trHeight w:val="460"/>
-        </w:trPr>
-        <w:tc>
-          <w:tcPr>
-            <w:tcW w:w="7089" w:type="dxa"/>
-            <w:gridSpan w:val="17"/>
-          </w:tcPr>
-          <w:p>
-            <w:pPr>
-              <w:autoSpaceDE w:val="0"/>
-              <w:autoSpaceDN w:val="0"/>
-              <w:adjustRightInd w:val="0"/>
-              <w:jc w:val="center"/>
-              <w:rPr>
-                <w:rFonts w:ascii="Arial" w:hAnsi="Arial" w:cs="Arial"/>
-                <w:b/>
-                <w:color w:val="000000"/>
-              </w:rPr>
-            </w:pPr>
-          </w:p>
-        </w:tc>
-        <w:tc>
-          <w:tcPr>
-            <w:tcW w:w="7932" w:type="dxa"/>
-            <w:gridSpan w:val="15"/>
-          </w:tcPr>
-          <w:p>
-            <w:pPr>
-              <w:autoSpaceDE w:val="0"/>
-              <w:autoSpaceDN w:val="0"/>
-              <w:adjustRightInd w:val="0"/>
-              <w:jc w:val="center"/>
-              <w:rPr>
-                <w:rFonts w:ascii="Arial" w:hAnsi="Arial" w:cs="Arial"/>
-                <w:b/>
-                <w:color w:val="000000"/>
-              </w:rPr>
-            </w:pPr>
-          </w:p>
-        </w:tc>
-      </w:tr>
-      <w:tr>
-        <w:trPr>
-          <w:trHeight w:val="460"/>
-        </w:trPr>
-        <w:tc>
-          <w:tcPr>
-            <w:tcW w:w="15021" w:type="dxa"/>
-            <w:gridSpan w:val="32"/>
-            <w:shd w:val="clear" w:color="auto" w:fill="F2F2F2" w:themeFill="background1" w:themeFillShade="F2"/>
-            <w:vAlign w:val="center"/>
-          </w:tcPr>
-          <w:p>
-            <w:pPr>
-              <w:autoSpaceDE w:val="0"/>
-              <w:autoSpaceDN w:val="0"/>
-              <w:adjustRightInd w:val="0"/>
-              <w:jc w:val="center"/>
-              <w:rPr>
-                <w:rFonts w:ascii="Arial" w:hAnsi="Arial" w:cs="Arial"/>
-                <w:b/>
-                <w:color w:val="000000"/>
-              </w:rPr>
-            </w:pPr>
-            <w:r>
-              <w:rPr>
-                <w:rFonts w:ascii="Arial" w:hAnsi="Arial" w:cs="Arial"/>
-                <w:b/>
-                <w:color w:val="000000"/>
-              </w:rPr>
-              <w:t>SEMANA 11:</w:t>
-            </w:r>
-          </w:p>
-        </w:tc>
-      </w:tr>
-      <w:tr>
-        <w:trPr>
-          <w:trHeight w:val="460"/>
-        </w:trPr>
-        <w:tc>
-          <w:tcPr>
-            <w:tcW w:w="7089" w:type="dxa"/>
-            <w:gridSpan w:val="17"/>
-          </w:tcPr>
-          <w:p>
-            <w:pPr>
-              <w:autoSpaceDE w:val="0"/>
-              <w:autoSpaceDN w:val="0"/>
-              <w:adjustRightInd w:val="0"/>
-              <w:jc w:val="center"/>
-              <w:rPr>
-                <w:rFonts w:ascii="Arial" w:hAnsi="Arial" w:cs="Arial"/>
-                <w:b/>
-                <w:color w:val="000000"/>
-              </w:rPr>
-            </w:pPr>
-          </w:p>
-        </w:tc>
-        <w:tc>
-          <w:tcPr>
-            <w:tcW w:w="7932" w:type="dxa"/>
-            <w:gridSpan w:val="15"/>
-          </w:tcPr>
-          <w:p>
-            <w:pPr>
-              <w:autoSpaceDE w:val="0"/>
-              <w:autoSpaceDN w:val="0"/>
-              <w:adjustRightInd w:val="0"/>
-              <w:jc w:val="center"/>
-              <w:rPr>
-                <w:rFonts w:ascii="Arial" w:hAnsi="Arial" w:cs="Arial"/>
-                <w:b/>
-                <w:color w:val="000000"/>
-              </w:rPr>
-            </w:pPr>
-          </w:p>
-        </w:tc>
-      </w:tr>
-      <w:tr>
-        <w:trPr>
-          <w:trHeight w:val="460"/>
-        </w:trPr>
-        <w:tc>
-          <w:tcPr>
-            <w:tcW w:w="15021" w:type="dxa"/>
-            <w:gridSpan w:val="32"/>
-            <w:shd w:val="clear" w:color="auto" w:fill="F2F2F2" w:themeFill="background1" w:themeFillShade="F2"/>
-            <w:vAlign w:val="center"/>
-          </w:tcPr>
-          <w:p>
-            <w:pPr>
-              <w:autoSpaceDE w:val="0"/>
-              <w:autoSpaceDN w:val="0"/>
-              <w:adjustRightInd w:val="0"/>
-              <w:jc w:val="center"/>
-              <w:rPr>
-                <w:rFonts w:ascii="Arial" w:hAnsi="Arial" w:cs="Arial"/>
-                <w:b/>
-                <w:color w:val="000000"/>
-              </w:rPr>
-            </w:pPr>
-            <w:r>
-              <w:rPr>
-                <w:rFonts w:ascii="Arial" w:hAnsi="Arial" w:cs="Arial"/>
-                <w:b/>
-                <w:color w:val="000000"/>
-              </w:rPr>
-              <w:t>SEMANA 12:</w:t>
-            </w:r>
-          </w:p>
-        </w:tc>
-      </w:tr>
-      <w:tr>
-        <w:trPr>
-          <w:trHeight w:val="460"/>
-        </w:trPr>
-        <w:tc>
-          <w:tcPr>
-            <w:tcW w:w="7089" w:type="dxa"/>
-            <w:gridSpan w:val="17"/>
-          </w:tcPr>
-          <w:p>
-            <w:pPr>
-              <w:autoSpaceDE w:val="0"/>
-              <w:autoSpaceDN w:val="0"/>
-              <w:adjustRightInd w:val="0"/>
-              <w:jc w:val="center"/>
-              <w:rPr>
-                <w:rFonts w:ascii="Arial" w:hAnsi="Arial" w:cs="Arial"/>
-                <w:b/>
-                <w:color w:val="000000"/>
-              </w:rPr>
-            </w:pPr>
-          </w:p>
-        </w:tc>
-        <w:tc>
-          <w:tcPr>
-            <w:tcW w:w="7932" w:type="dxa"/>
-            <w:gridSpan w:val="15"/>
-          </w:tcPr>
-          <w:p>
-            <w:pPr>
-              <w:autoSpaceDE w:val="0"/>
-              <w:autoSpaceDN w:val="0"/>
-              <w:adjustRightInd w:val="0"/>
-              <w:jc w:val="center"/>
-              <w:rPr>
-                <w:rFonts w:ascii="Arial" w:hAnsi="Arial" w:cs="Arial"/>
-                <w:b/>
-                <w:color w:val="000000"/>
-              </w:rPr>
-            </w:pPr>
+            <w:r>
+              <w:rPr>
+                <w:rFonts w:ascii="Arial" w:hAnsi="Arial" w:cs="Arial"/>
+                <w:lang w:val="es-EC"/>
+              </w:rPr>
+              <w:t>{{estrategia}}{{/estrategias}}</w:t>
+            </w:r>
           </w:p>
         </w:tc>
       </w:tr>
@@ -1841,6 +2658,13 @@
               </w:rPr>
               <w:t xml:space="preserve">Docente: </w:t>
             </w:r>
+            <w:r>
+              <w:rPr>
+                <w:rFonts w:ascii="Arial" w:hAnsi="Arial" w:cs="Arial"/>
+                <w:lang w:val="es-EC"/>
+              </w:rPr>
+              <w:t>{{nombre_docente}}</w:t>
+            </w:r>
           </w:p>
           <w:p>
             <w:pPr>
@@ -1914,7 +2738,7 @@
                 <w:szCs w:val="20"/>
                 <w:lang w:eastAsia="es-EC"/>
               </w:rPr>
-              <w:t>LIC. MARCO SALAZAR</w:t>
+              <w:t>{{nombre_coordinador}}</w:t>
             </w:r>
           </w:p>
           <w:p>
@@ -1960,6 +2784,13 @@
               </w:rPr>
               <w:t xml:space="preserve">DECE: </w:t>
             </w:r>
+            <w:r>
+              <w:rPr>
+                <w:rFonts w:ascii="Arial" w:hAnsi="Arial" w:cs="Arial"/>
+                <w:lang w:val="es-EC"/>
+              </w:rPr>
+              <w:t>{{nombre_dece}}</w:t>
+            </w:r>
           </w:p>
           <w:p>
             <w:pPr>
@@ -2021,7 +2852,7 @@
                 <w:szCs w:val="20"/>
                 <w:lang w:eastAsia="es-EC"/>
               </w:rPr>
-              <w:t>MSC. JAVIER CASTILLO</w:t>
+              <w:t>{{nombre_vicerrector}}</w:t>
             </w:r>
           </w:p>
         </w:tc>

</xml_diff>